<commit_message>
Notificaciones push, horarios por zona del paciente y documento de requerimientos
</commit_message>
<xml_diff>
--- a/docs/Chronova-Requerimientos.docx
+++ b/docs/Chronova-Requerimientos.docx
@@ -5464,7 +5464,297 @@
                 <w:sz w:val="16"/>
                 <w:szCs w:val="16"/>
               </w:rPr>
-              <w:t xml:space="preserve">CerrarTomasVencidas (parcial)</w:t>
+              <w:t xml:space="preserve">NotificadorExpoPush</w:t>
+            </w:r>
+          </w:p>
+        </w:tc>
+      </w:tr>
+      <w:tr>
+        <w:trPr>
+          <w:cantSplit/>
+        </w:trPr>
+        <w:tc>
+          <w:tcPr>
+            <w:tcW w:type="dxa" w:w="700"/>
+            <w:shd w:fill="FFFFFF" w:val="clear"/>
+            <w:tcMar>
+              <w:top w:type="dxa" w:w="60"/>
+              <w:left w:type="dxa" w:w="100"/>
+              <w:bottom w:type="dxa" w:w="60"/>
+              <w:right w:type="dxa" w:w="100"/>
+            </w:tcMar>
+          </w:tcPr>
+          <w:p>
+            <w:pPr>
+              <w:spacing w:after="0" w:line="240"/>
+              <w:jc w:val="center"/>
+            </w:pPr>
+            <w:r>
+              <w:rPr>
+                <w:rFonts w:ascii="Cambria" w:cs="Cambria" w:eastAsia="Cambria" w:hAnsi="Cambria"/>
+                <w:b w:val="false"/>
+                <w:bCs w:val="false"/>
+                <w:sz w:val="18"/>
+                <w:szCs w:val="18"/>
+              </w:rPr>
+              <w:t xml:space="preserve">RF-29</w:t>
+            </w:r>
+          </w:p>
+        </w:tc>
+        <w:tc>
+          <w:tcPr>
+            <w:tcW w:type="dxa" w:w="3000"/>
+            <w:shd w:fill="FFFFFF" w:val="clear"/>
+            <w:tcMar>
+              <w:top w:type="dxa" w:w="60"/>
+              <w:left w:type="dxa" w:w="100"/>
+              <w:bottom w:type="dxa" w:w="60"/>
+              <w:right w:type="dxa" w:w="100"/>
+            </w:tcMar>
+          </w:tcPr>
+          <w:p>
+            <w:pPr>
+              <w:spacing w:after="0" w:line="240"/>
+              <w:jc w:val="left"/>
+            </w:pPr>
+            <w:r>
+              <w:rPr>
+                <w:rFonts w:ascii="Cambria" w:cs="Cambria" w:eastAsia="Cambria" w:hAnsi="Cambria"/>
+                <w:b w:val="false"/>
+                <w:bCs w:val="false"/>
+                <w:sz w:val="18"/>
+                <w:szCs w:val="18"/>
+              </w:rPr>
+              <w:t xml:space="preserve">El sistema debe permitir registrar el teléfono de una persona para recibir notificaciones remotas.</w:t>
+            </w:r>
+          </w:p>
+        </w:tc>
+        <w:tc>
+          <w:tcPr>
+            <w:tcW w:type="dxa" w:w="1150"/>
+            <w:shd w:fill="FFFFFF" w:val="clear"/>
+            <w:tcMar>
+              <w:top w:type="dxa" w:w="60"/>
+              <w:left w:type="dxa" w:w="100"/>
+              <w:bottom w:type="dxa" w:w="60"/>
+              <w:right w:type="dxa" w:w="100"/>
+            </w:tcMar>
+          </w:tcPr>
+          <w:p>
+            <w:pPr>
+              <w:spacing w:after="0" w:line="240"/>
+              <w:jc w:val="left"/>
+            </w:pPr>
+            <w:r>
+              <w:rPr>
+                <w:rFonts w:ascii="Cambria" w:cs="Cambria" w:eastAsia="Cambria" w:hAnsi="Cambria"/>
+                <w:b w:val="false"/>
+                <w:bCs w:val="false"/>
+                <w:sz w:val="18"/>
+                <w:szCs w:val="18"/>
+              </w:rPr>
+              <w:t xml:space="preserve">Ambos</w:t>
+            </w:r>
+          </w:p>
+        </w:tc>
+        <w:tc>
+          <w:tcPr>
+            <w:tcW w:type="dxa" w:w="1000"/>
+            <w:shd w:fill="FFFFFF" w:val="clear"/>
+            <w:tcMar>
+              <w:top w:type="dxa" w:w="60"/>
+              <w:left w:type="dxa" w:w="100"/>
+              <w:bottom w:type="dxa" w:w="60"/>
+              <w:right w:type="dxa" w:w="100"/>
+            </w:tcMar>
+          </w:tcPr>
+          <w:p>
+            <w:pPr>
+              <w:spacing w:after="0" w:line="240"/>
+              <w:jc w:val="center"/>
+            </w:pPr>
+            <w:r>
+              <w:rPr>
+                <w:rFonts w:ascii="Cambria" w:cs="Cambria" w:eastAsia="Cambria" w:hAnsi="Cambria"/>
+                <w:b w:val="false"/>
+                <w:bCs w:val="false"/>
+                <w:sz w:val="18"/>
+                <w:szCs w:val="18"/>
+              </w:rPr>
+              <w:t xml:space="preserve">Media</w:t>
+            </w:r>
+          </w:p>
+        </w:tc>
+        <w:tc>
+          <w:tcPr>
+            <w:tcW w:type="dxa" w:w="2910"/>
+            <w:shd w:fill="FFFFFF" w:val="clear"/>
+            <w:tcMar>
+              <w:top w:type="dxa" w:w="60"/>
+              <w:left w:type="dxa" w:w="100"/>
+              <w:bottom w:type="dxa" w:w="60"/>
+              <w:right w:type="dxa" w:w="100"/>
+            </w:tcMar>
+          </w:tcPr>
+          <w:p>
+            <w:pPr>
+              <w:spacing w:after="0" w:line="240"/>
+              <w:jc w:val="left"/>
+            </w:pPr>
+            <w:r>
+              <w:rPr>
+                <w:rFonts w:ascii="Consolas" w:cs="Consolas" w:eastAsia="Consolas" w:hAnsi="Consolas"/>
+                <w:b w:val="false"/>
+                <w:bCs w:val="false"/>
+                <w:sz w:val="16"/>
+                <w:szCs w:val="16"/>
+              </w:rPr>
+              <w:t xml:space="preserve">RegistrarDispositivo</w:t>
+            </w:r>
+          </w:p>
+        </w:tc>
+      </w:tr>
+      <w:tr>
+        <w:trPr>
+          <w:cantSplit/>
+        </w:trPr>
+        <w:tc>
+          <w:tcPr>
+            <w:tcW w:type="dxa" w:w="700"/>
+            <w:shd w:fill="F4F7F6" w:val="clear"/>
+            <w:tcMar>
+              <w:top w:type="dxa" w:w="60"/>
+              <w:left w:type="dxa" w:w="100"/>
+              <w:bottom w:type="dxa" w:w="60"/>
+              <w:right w:type="dxa" w:w="100"/>
+            </w:tcMar>
+          </w:tcPr>
+          <w:p>
+            <w:pPr>
+              <w:spacing w:after="0" w:line="240"/>
+              <w:jc w:val="center"/>
+            </w:pPr>
+            <w:r>
+              <w:rPr>
+                <w:rFonts w:ascii="Cambria" w:cs="Cambria" w:eastAsia="Cambria" w:hAnsi="Cambria"/>
+                <w:b w:val="false"/>
+                <w:bCs w:val="false"/>
+                <w:sz w:val="18"/>
+                <w:szCs w:val="18"/>
+              </w:rPr>
+              <w:t xml:space="preserve">RF-30</w:t>
+            </w:r>
+          </w:p>
+        </w:tc>
+        <w:tc>
+          <w:tcPr>
+            <w:tcW w:type="dxa" w:w="3000"/>
+            <w:shd w:fill="F4F7F6" w:val="clear"/>
+            <w:tcMar>
+              <w:top w:type="dxa" w:w="60"/>
+              <w:left w:type="dxa" w:w="100"/>
+              <w:bottom w:type="dxa" w:w="60"/>
+              <w:right w:type="dxa" w:w="100"/>
+            </w:tcMar>
+          </w:tcPr>
+          <w:p>
+            <w:pPr>
+              <w:spacing w:after="0" w:line="240"/>
+              <w:jc w:val="left"/>
+            </w:pPr>
+            <w:r>
+              <w:rPr>
+                <w:rFonts w:ascii="Cambria" w:cs="Cambria" w:eastAsia="Cambria" w:hAnsi="Cambria"/>
+                <w:b w:val="false"/>
+                <w:bCs w:val="false"/>
+                <w:sz w:val="18"/>
+                <w:szCs w:val="18"/>
+              </w:rPr>
+              <w:t xml:space="preserve">El sistema debe dar de baja el teléfono al cerrar sesión, y también cuando el servicio informe que la aplicación fue desinstalada.</w:t>
+            </w:r>
+          </w:p>
+        </w:tc>
+        <w:tc>
+          <w:tcPr>
+            <w:tcW w:type="dxa" w:w="1150"/>
+            <w:shd w:fill="F4F7F6" w:val="clear"/>
+            <w:tcMar>
+              <w:top w:type="dxa" w:w="60"/>
+              <w:left w:type="dxa" w:w="100"/>
+              <w:bottom w:type="dxa" w:w="60"/>
+              <w:right w:type="dxa" w:w="100"/>
+            </w:tcMar>
+          </w:tcPr>
+          <w:p>
+            <w:pPr>
+              <w:spacing w:after="0" w:line="240"/>
+              <w:jc w:val="left"/>
+            </w:pPr>
+            <w:r>
+              <w:rPr>
+                <w:rFonts w:ascii="Cambria" w:cs="Cambria" w:eastAsia="Cambria" w:hAnsi="Cambria"/>
+                <w:b w:val="false"/>
+                <w:bCs w:val="false"/>
+                <w:sz w:val="18"/>
+                <w:szCs w:val="18"/>
+              </w:rPr>
+              <w:t xml:space="preserve">Ambos</w:t>
+            </w:r>
+          </w:p>
+        </w:tc>
+        <w:tc>
+          <w:tcPr>
+            <w:tcW w:type="dxa" w:w="1000"/>
+            <w:shd w:fill="F4F7F6" w:val="clear"/>
+            <w:tcMar>
+              <w:top w:type="dxa" w:w="60"/>
+              <w:left w:type="dxa" w:w="100"/>
+              <w:bottom w:type="dxa" w:w="60"/>
+              <w:right w:type="dxa" w:w="100"/>
+            </w:tcMar>
+          </w:tcPr>
+          <w:p>
+            <w:pPr>
+              <w:spacing w:after="0" w:line="240"/>
+              <w:jc w:val="center"/>
+            </w:pPr>
+            <w:r>
+              <w:rPr>
+                <w:rFonts w:ascii="Cambria" w:cs="Cambria" w:eastAsia="Cambria" w:hAnsi="Cambria"/>
+                <w:b w:val="false"/>
+                <w:bCs w:val="false"/>
+                <w:sz w:val="18"/>
+                <w:szCs w:val="18"/>
+              </w:rPr>
+              <w:t xml:space="preserve">Media</w:t>
+            </w:r>
+          </w:p>
+        </w:tc>
+        <w:tc>
+          <w:tcPr>
+            <w:tcW w:type="dxa" w:w="2910"/>
+            <w:shd w:fill="F4F7F6" w:val="clear"/>
+            <w:tcMar>
+              <w:top w:type="dxa" w:w="60"/>
+              <w:left w:type="dxa" w:w="100"/>
+              <w:bottom w:type="dxa" w:w="60"/>
+              <w:right w:type="dxa" w:w="100"/>
+            </w:tcMar>
+          </w:tcPr>
+          <w:p>
+            <w:pPr>
+              <w:spacing w:after="0" w:line="240"/>
+              <w:jc w:val="left"/>
+            </w:pPr>
+            <w:r>
+              <w:rPr>
+                <w:rFonts w:ascii="Consolas" w:cs="Consolas" w:eastAsia="Consolas" w:hAnsi="Consolas"/>
+                <w:b w:val="false"/>
+                <w:bCs w:val="false"/>
+                <w:sz w:val="16"/>
+                <w:szCs w:val="16"/>
+              </w:rPr>
+              <w:t xml:space="preserve">OlvidarDispositivo</w:t>
             </w:r>
           </w:p>
         </w:tc>
@@ -5486,7 +5776,7 @@
           <w:sz w:val="24"/>
           <w:szCs w:val="24"/>
         </w:rPr>
-        <w:t xml:space="preserve">De los veintiocho requerimientos, veintisiete están implementados y verificados. El RF-28 está parcialmente resuelto: el sistema genera el aviso y lo registra, pero todavía no lo entrega como notificación al teléfono del cuidador; esa integración es el siguiente paso del desarrollo.</w:t>
+        <w:t xml:space="preserve">Los treinta requerimientos están implementados y verificados. La entrega efectiva del RF-28 en un teléfono real depende de configurar el identificador de proyecto de Expo, que es un paso de despliegue y no de desarrollo: la lógica de envío, el reparto por lotes y la baja de dispositivos desinstalados están cubiertos por pruebas automatizadas.</w:t>
       </w:r>
     </w:p>
     <w:p>
@@ -7639,7 +7929,7 @@
                 <w:sz w:val="18"/>
                 <w:szCs w:val="18"/>
               </w:rPr>
-              <w:t xml:space="preserve">87 pruebas en menos de dos segundos. Verificado.</w:t>
+              <w:t xml:space="preserve">99 pruebas en menos de dos segundos. Verificado.</w:t>
             </w:r>
           </w:p>
         </w:tc>
@@ -7991,6 +8281,240 @@
                 <w:szCs w:val="18"/>
               </w:rPr>
               <w:t xml:space="preserve">Ejecución en dispositivo y verificación de tipos y compilación. Verificado.</w:t>
+            </w:r>
+          </w:p>
+        </w:tc>
+      </w:tr>
+      <w:tr>
+        <w:trPr>
+          <w:cantSplit/>
+        </w:trPr>
+        <w:tc>
+          <w:tcPr>
+            <w:tcW w:type="dxa" w:w="900"/>
+            <w:shd w:fill="FFFFFF" w:val="clear"/>
+            <w:tcMar>
+              <w:top w:type="dxa" w:w="60"/>
+              <w:left w:type="dxa" w:w="100"/>
+              <w:bottom w:type="dxa" w:w="60"/>
+              <w:right w:type="dxa" w:w="100"/>
+            </w:tcMar>
+          </w:tcPr>
+          <w:p>
+            <w:pPr>
+              <w:spacing w:after="0" w:line="240"/>
+              <w:jc w:val="center"/>
+            </w:pPr>
+            <w:r>
+              <w:rPr>
+                <w:rFonts w:ascii="Cambria" w:cs="Cambria" w:eastAsia="Cambria" w:hAnsi="Cambria"/>
+                <w:b w:val="false"/>
+                <w:bCs w:val="false"/>
+                <w:sz w:val="18"/>
+                <w:szCs w:val="18"/>
+              </w:rPr>
+              <w:t xml:space="preserve">RNF-21</w:t>
+            </w:r>
+          </w:p>
+        </w:tc>
+        <w:tc>
+          <w:tcPr>
+            <w:tcW w:type="dxa" w:w="1350"/>
+            <w:shd w:fill="FFFFFF" w:val="clear"/>
+            <w:tcMar>
+              <w:top w:type="dxa" w:w="60"/>
+              <w:left w:type="dxa" w:w="100"/>
+              <w:bottom w:type="dxa" w:w="60"/>
+              <w:right w:type="dxa" w:w="100"/>
+            </w:tcMar>
+          </w:tcPr>
+          <w:p>
+            <w:pPr>
+              <w:spacing w:after="0" w:line="240"/>
+              <w:jc w:val="left"/>
+            </w:pPr>
+            <w:r>
+              <w:rPr>
+                <w:rFonts w:ascii="Cambria" w:cs="Cambria" w:eastAsia="Cambria" w:hAnsi="Cambria"/>
+                <w:b w:val="false"/>
+                <w:bCs w:val="false"/>
+                <w:sz w:val="18"/>
+                <w:szCs w:val="18"/>
+              </w:rPr>
+              <w:t xml:space="preserve">Resiliencia</w:t>
+            </w:r>
+          </w:p>
+        </w:tc>
+        <w:tc>
+          <w:tcPr>
+            <w:tcW w:type="dxa" w:w="3200"/>
+            <w:shd w:fill="FFFFFF" w:val="clear"/>
+            <w:tcMar>
+              <w:top w:type="dxa" w:w="60"/>
+              <w:left w:type="dxa" w:w="100"/>
+              <w:bottom w:type="dxa" w:w="60"/>
+              <w:right w:type="dxa" w:w="100"/>
+            </w:tcMar>
+          </w:tcPr>
+          <w:p>
+            <w:pPr>
+              <w:spacing w:after="0" w:line="240"/>
+              <w:jc w:val="left"/>
+            </w:pPr>
+            <w:r>
+              <w:rPr>
+                <w:rFonts w:ascii="Cambria" w:cs="Cambria" w:eastAsia="Cambria" w:hAnsi="Cambria"/>
+                <w:b w:val="false"/>
+                <w:bCs w:val="false"/>
+                <w:sz w:val="18"/>
+                <w:szCs w:val="18"/>
+              </w:rPr>
+              <w:t xml:space="preserve">Un fallo del servicio de notificaciones no impedirá registrar ni cerrar una toma.</w:t>
+            </w:r>
+          </w:p>
+        </w:tc>
+        <w:tc>
+          <w:tcPr>
+            <w:tcW w:type="dxa" w:w="3310"/>
+            <w:shd w:fill="FFFFFF" w:val="clear"/>
+            <w:tcMar>
+              <w:top w:type="dxa" w:w="60"/>
+              <w:left w:type="dxa" w:w="100"/>
+              <w:bottom w:type="dxa" w:w="60"/>
+              <w:right w:type="dxa" w:w="100"/>
+            </w:tcMar>
+          </w:tcPr>
+          <w:p>
+            <w:pPr>
+              <w:spacing w:after="0" w:line="240"/>
+              <w:jc w:val="left"/>
+            </w:pPr>
+            <w:r>
+              <w:rPr>
+                <w:rFonts w:ascii="Cambria" w:cs="Cambria" w:eastAsia="Cambria" w:hAnsi="Cambria"/>
+                <w:b w:val="false"/>
+                <w:bCs w:val="false"/>
+                <w:sz w:val="18"/>
+                <w:szCs w:val="18"/>
+              </w:rPr>
+              <w:t xml:space="preserve">Verificado con el servicio inaccesible: las cuatro tomas vencidas se cerraron igual y el fallo solo quedó en el registro. Verificado.</w:t>
+            </w:r>
+          </w:p>
+        </w:tc>
+      </w:tr>
+      <w:tr>
+        <w:trPr>
+          <w:cantSplit/>
+        </w:trPr>
+        <w:tc>
+          <w:tcPr>
+            <w:tcW w:type="dxa" w:w="900"/>
+            <w:shd w:fill="F4F7F6" w:val="clear"/>
+            <w:tcMar>
+              <w:top w:type="dxa" w:w="60"/>
+              <w:left w:type="dxa" w:w="100"/>
+              <w:bottom w:type="dxa" w:w="60"/>
+              <w:right w:type="dxa" w:w="100"/>
+            </w:tcMar>
+          </w:tcPr>
+          <w:p>
+            <w:pPr>
+              <w:spacing w:after="0" w:line="240"/>
+              <w:jc w:val="center"/>
+            </w:pPr>
+            <w:r>
+              <w:rPr>
+                <w:rFonts w:ascii="Cambria" w:cs="Cambria" w:eastAsia="Cambria" w:hAnsi="Cambria"/>
+                <w:b w:val="false"/>
+                <w:bCs w:val="false"/>
+                <w:sz w:val="18"/>
+                <w:szCs w:val="18"/>
+              </w:rPr>
+              <w:t xml:space="preserve">RNF-22</w:t>
+            </w:r>
+          </w:p>
+        </w:tc>
+        <w:tc>
+          <w:tcPr>
+            <w:tcW w:type="dxa" w:w="1350"/>
+            <w:shd w:fill="F4F7F6" w:val="clear"/>
+            <w:tcMar>
+              <w:top w:type="dxa" w:w="60"/>
+              <w:left w:type="dxa" w:w="100"/>
+              <w:bottom w:type="dxa" w:w="60"/>
+              <w:right w:type="dxa" w:w="100"/>
+            </w:tcMar>
+          </w:tcPr>
+          <w:p>
+            <w:pPr>
+              <w:spacing w:after="0" w:line="240"/>
+              <w:jc w:val="left"/>
+            </w:pPr>
+            <w:r>
+              <w:rPr>
+                <w:rFonts w:ascii="Cambria" w:cs="Cambria" w:eastAsia="Cambria" w:hAnsi="Cambria"/>
+                <w:b w:val="false"/>
+                <w:bCs w:val="false"/>
+                <w:sz w:val="18"/>
+                <w:szCs w:val="18"/>
+              </w:rPr>
+              <w:t xml:space="preserve">Mantenibilidad</w:t>
+            </w:r>
+          </w:p>
+        </w:tc>
+        <w:tc>
+          <w:tcPr>
+            <w:tcW w:type="dxa" w:w="3200"/>
+            <w:shd w:fill="F4F7F6" w:val="clear"/>
+            <w:tcMar>
+              <w:top w:type="dxa" w:w="60"/>
+              <w:left w:type="dxa" w:w="100"/>
+              <w:bottom w:type="dxa" w:w="60"/>
+              <w:right w:type="dxa" w:w="100"/>
+            </w:tcMar>
+          </w:tcPr>
+          <w:p>
+            <w:pPr>
+              <w:spacing w:after="0" w:line="240"/>
+              <w:jc w:val="left"/>
+            </w:pPr>
+            <w:r>
+              <w:rPr>
+                <w:rFonts w:ascii="Cambria" w:cs="Cambria" w:eastAsia="Cambria" w:hAnsi="Cambria"/>
+                <w:b w:val="false"/>
+                <w:bCs w:val="false"/>
+                <w:sz w:val="18"/>
+                <w:szCs w:val="18"/>
+              </w:rPr>
+              <w:t xml:space="preserve">Los tokens de dispositivos que dejen de existir se darán de baja automáticamente, sin intervención manual.</w:t>
+            </w:r>
+          </w:p>
+        </w:tc>
+        <w:tc>
+          <w:tcPr>
+            <w:tcW w:type="dxa" w:w="3310"/>
+            <w:shd w:fill="F4F7F6" w:val="clear"/>
+            <w:tcMar>
+              <w:top w:type="dxa" w:w="60"/>
+              <w:left w:type="dxa" w:w="100"/>
+              <w:bottom w:type="dxa" w:w="60"/>
+              <w:right w:type="dxa" w:w="100"/>
+            </w:tcMar>
+          </w:tcPr>
+          <w:p>
+            <w:pPr>
+              <w:spacing w:after="0" w:line="240"/>
+              <w:jc w:val="left"/>
+            </w:pPr>
+            <w:r>
+              <w:rPr>
+                <w:rFonts w:ascii="Cambria" w:cs="Cambria" w:eastAsia="Cambria" w:hAnsi="Cambria"/>
+                <w:b w:val="false"/>
+                <w:bCs w:val="false"/>
+                <w:sz w:val="18"/>
+                <w:szCs w:val="18"/>
+              </w:rPr>
+              <w:t xml:space="preserve">Prueba automatizada del acuse DeviceNotRegistered. Verificado.</w:t>
             </w:r>
           </w:p>
         </w:tc>
@@ -8057,7 +8581,7 @@
           <w:sz w:val="24"/>
           <w:szCs w:val="24"/>
         </w:rPr>
-        <w:t xml:space="preserve">Las pruebas correspondientes se encuentran en los archivos dominio.test.ts, zonaHoraria.test.ts y casosDeUso.test.ts del directorio de pruebas del backend, y se ejecutan con el comando npm test.</w:t>
+        <w:t xml:space="preserve">Las pruebas correspondientes se encuentran en los archivos dominio.test.ts, zonaHoraria.test.ts, casosDeUso.test.ts y notificaciones.test.ts del directorio de pruebas del backend, y se ejecutan con el comando npm test.</w:t>
       </w:r>
     </w:p>
     <w:sectPr>

</xml_diff>

<commit_message>
Pantalla de detalle del paciente para el cuidador
</commit_message>
<xml_diff>
--- a/docs/Chronova-Requerimientos.docx
+++ b/docs/Chronova-Requerimientos.docx
@@ -5759,6 +5759,296 @@
           </w:p>
         </w:tc>
       </w:tr>
+      <w:tr>
+        <w:trPr>
+          <w:cantSplit/>
+        </w:trPr>
+        <w:tc>
+          <w:tcPr>
+            <w:tcW w:type="dxa" w:w="700"/>
+            <w:shd w:fill="FFFFFF" w:val="clear"/>
+            <w:tcMar>
+              <w:top w:type="dxa" w:w="60"/>
+              <w:left w:type="dxa" w:w="100"/>
+              <w:bottom w:type="dxa" w:w="60"/>
+              <w:right w:type="dxa" w:w="100"/>
+            </w:tcMar>
+          </w:tcPr>
+          <w:p>
+            <w:pPr>
+              <w:spacing w:after="0" w:line="240"/>
+              <w:jc w:val="center"/>
+            </w:pPr>
+            <w:r>
+              <w:rPr>
+                <w:rFonts w:ascii="Cambria" w:cs="Cambria" w:eastAsia="Cambria" w:hAnsi="Cambria"/>
+                <w:b w:val="false"/>
+                <w:bCs w:val="false"/>
+                <w:sz w:val="18"/>
+                <w:szCs w:val="18"/>
+              </w:rPr>
+              <w:t xml:space="preserve">RF-31</w:t>
+            </w:r>
+          </w:p>
+        </w:tc>
+        <w:tc>
+          <w:tcPr>
+            <w:tcW w:type="dxa" w:w="3000"/>
+            <w:shd w:fill="FFFFFF" w:val="clear"/>
+            <w:tcMar>
+              <w:top w:type="dxa" w:w="60"/>
+              <w:left w:type="dxa" w:w="100"/>
+              <w:bottom w:type="dxa" w:w="60"/>
+              <w:right w:type="dxa" w:w="100"/>
+            </w:tcMar>
+          </w:tcPr>
+          <w:p>
+            <w:pPr>
+              <w:spacing w:after="0" w:line="240"/>
+              <w:jc w:val="left"/>
+            </w:pPr>
+            <w:r>
+              <w:rPr>
+                <w:rFonts w:ascii="Cambria" w:cs="Cambria" w:eastAsia="Cambria" w:hAnsi="Cambria"/>
+                <w:b w:val="false"/>
+                <w:bCs w:val="false"/>
+                <w:sz w:val="18"/>
+                <w:szCs w:val="18"/>
+              </w:rPr>
+              <w:t xml:space="preserve">El sistema debe permitir al cuidador autorizado consultar el detalle de un paciente: su agenda del día, su tratamiento vigente y las tomas que no realizó.</w:t>
+            </w:r>
+          </w:p>
+        </w:tc>
+        <w:tc>
+          <w:tcPr>
+            <w:tcW w:type="dxa" w:w="1150"/>
+            <w:shd w:fill="FFFFFF" w:val="clear"/>
+            <w:tcMar>
+              <w:top w:type="dxa" w:w="60"/>
+              <w:left w:type="dxa" w:w="100"/>
+              <w:bottom w:type="dxa" w:w="60"/>
+              <w:right w:type="dxa" w:w="100"/>
+            </w:tcMar>
+          </w:tcPr>
+          <w:p>
+            <w:pPr>
+              <w:spacing w:after="0" w:line="240"/>
+              <w:jc w:val="left"/>
+            </w:pPr>
+            <w:r>
+              <w:rPr>
+                <w:rFonts w:ascii="Cambria" w:cs="Cambria" w:eastAsia="Cambria" w:hAnsi="Cambria"/>
+                <w:b w:val="false"/>
+                <w:bCs w:val="false"/>
+                <w:sz w:val="18"/>
+                <w:szCs w:val="18"/>
+              </w:rPr>
+              <w:t xml:space="preserve">Cuidador</w:t>
+            </w:r>
+          </w:p>
+        </w:tc>
+        <w:tc>
+          <w:tcPr>
+            <w:tcW w:type="dxa" w:w="1000"/>
+            <w:shd w:fill="FFFFFF" w:val="clear"/>
+            <w:tcMar>
+              <w:top w:type="dxa" w:w="60"/>
+              <w:left w:type="dxa" w:w="100"/>
+              <w:bottom w:type="dxa" w:w="60"/>
+              <w:right w:type="dxa" w:w="100"/>
+            </w:tcMar>
+          </w:tcPr>
+          <w:p>
+            <w:pPr>
+              <w:spacing w:after="0" w:line="240"/>
+              <w:jc w:val="center"/>
+            </w:pPr>
+            <w:r>
+              <w:rPr>
+                <w:rFonts w:ascii="Cambria" w:cs="Cambria" w:eastAsia="Cambria" w:hAnsi="Cambria"/>
+                <w:b w:val="false"/>
+                <w:bCs w:val="false"/>
+                <w:sz w:val="18"/>
+                <w:szCs w:val="18"/>
+              </w:rPr>
+              <w:t xml:space="preserve">Alta</w:t>
+            </w:r>
+          </w:p>
+        </w:tc>
+        <w:tc>
+          <w:tcPr>
+            <w:tcW w:type="dxa" w:w="2910"/>
+            <w:shd w:fill="FFFFFF" w:val="clear"/>
+            <w:tcMar>
+              <w:top w:type="dxa" w:w="60"/>
+              <w:left w:type="dxa" w:w="100"/>
+              <w:bottom w:type="dxa" w:w="60"/>
+              <w:right w:type="dxa" w:w="100"/>
+            </w:tcMar>
+          </w:tcPr>
+          <w:p>
+            <w:pPr>
+              <w:spacing w:after="0" w:line="240"/>
+              <w:jc w:val="left"/>
+            </w:pPr>
+            <w:r>
+              <w:rPr>
+                <w:rFonts w:ascii="Consolas" w:cs="Consolas" w:eastAsia="Consolas" w:hAnsi="Consolas"/>
+                <w:b w:val="false"/>
+                <w:bCs w:val="false"/>
+                <w:sz w:val="16"/>
+                <w:szCs w:val="16"/>
+              </w:rPr>
+              <w:t xml:space="preserve">ObtenerAgendaDelDia</w:t>
+            </w:r>
+          </w:p>
+        </w:tc>
+      </w:tr>
+      <w:tr>
+        <w:trPr>
+          <w:cantSplit/>
+        </w:trPr>
+        <w:tc>
+          <w:tcPr>
+            <w:tcW w:type="dxa" w:w="700"/>
+            <w:shd w:fill="F4F7F6" w:val="clear"/>
+            <w:tcMar>
+              <w:top w:type="dxa" w:w="60"/>
+              <w:left w:type="dxa" w:w="100"/>
+              <w:bottom w:type="dxa" w:w="60"/>
+              <w:right w:type="dxa" w:w="100"/>
+            </w:tcMar>
+          </w:tcPr>
+          <w:p>
+            <w:pPr>
+              <w:spacing w:after="0" w:line="240"/>
+              <w:jc w:val="center"/>
+            </w:pPr>
+            <w:r>
+              <w:rPr>
+                <w:rFonts w:ascii="Cambria" w:cs="Cambria" w:eastAsia="Cambria" w:hAnsi="Cambria"/>
+                <w:b w:val="false"/>
+                <w:bCs w:val="false"/>
+                <w:sz w:val="18"/>
+                <w:szCs w:val="18"/>
+              </w:rPr>
+              <w:t xml:space="preserve">RF-32</w:t>
+            </w:r>
+          </w:p>
+        </w:tc>
+        <w:tc>
+          <w:tcPr>
+            <w:tcW w:type="dxa" w:w="3000"/>
+            <w:shd w:fill="F4F7F6" w:val="clear"/>
+            <w:tcMar>
+              <w:top w:type="dxa" w:w="60"/>
+              <w:left w:type="dxa" w:w="100"/>
+              <w:bottom w:type="dxa" w:w="60"/>
+              <w:right w:type="dxa" w:w="100"/>
+            </w:tcMar>
+          </w:tcPr>
+          <w:p>
+            <w:pPr>
+              <w:spacing w:after="0" w:line="240"/>
+              <w:jc w:val="left"/>
+            </w:pPr>
+            <w:r>
+              <w:rPr>
+                <w:rFonts w:ascii="Cambria" w:cs="Cambria" w:eastAsia="Cambria" w:hAnsi="Cambria"/>
+                <w:b w:val="false"/>
+                <w:bCs w:val="false"/>
+                <w:sz w:val="18"/>
+                <w:szCs w:val="18"/>
+              </w:rPr>
+              <w:t xml:space="preserve">La aplicación debe abrir directamente la información del paciente al que se refiere una notificación cuando el cuidador la toca.</w:t>
+            </w:r>
+          </w:p>
+        </w:tc>
+        <w:tc>
+          <w:tcPr>
+            <w:tcW w:type="dxa" w:w="1150"/>
+            <w:shd w:fill="F4F7F6" w:val="clear"/>
+            <w:tcMar>
+              <w:top w:type="dxa" w:w="60"/>
+              <w:left w:type="dxa" w:w="100"/>
+              <w:bottom w:type="dxa" w:w="60"/>
+              <w:right w:type="dxa" w:w="100"/>
+            </w:tcMar>
+          </w:tcPr>
+          <w:p>
+            <w:pPr>
+              <w:spacing w:after="0" w:line="240"/>
+              <w:jc w:val="left"/>
+            </w:pPr>
+            <w:r>
+              <w:rPr>
+                <w:rFonts w:ascii="Cambria" w:cs="Cambria" w:eastAsia="Cambria" w:hAnsi="Cambria"/>
+                <w:b w:val="false"/>
+                <w:bCs w:val="false"/>
+                <w:sz w:val="18"/>
+                <w:szCs w:val="18"/>
+              </w:rPr>
+              <w:t xml:space="preserve">Sistema</w:t>
+            </w:r>
+          </w:p>
+        </w:tc>
+        <w:tc>
+          <w:tcPr>
+            <w:tcW w:type="dxa" w:w="1000"/>
+            <w:shd w:fill="F4F7F6" w:val="clear"/>
+            <w:tcMar>
+              <w:top w:type="dxa" w:w="60"/>
+              <w:left w:type="dxa" w:w="100"/>
+              <w:bottom w:type="dxa" w:w="60"/>
+              <w:right w:type="dxa" w:w="100"/>
+            </w:tcMar>
+          </w:tcPr>
+          <w:p>
+            <w:pPr>
+              <w:spacing w:after="0" w:line="240"/>
+              <w:jc w:val="center"/>
+            </w:pPr>
+            <w:r>
+              <w:rPr>
+                <w:rFonts w:ascii="Cambria" w:cs="Cambria" w:eastAsia="Cambria" w:hAnsi="Cambria"/>
+                <w:b w:val="false"/>
+                <w:bCs w:val="false"/>
+                <w:sz w:val="18"/>
+                <w:szCs w:val="18"/>
+              </w:rPr>
+              <w:t xml:space="preserve">Media</w:t>
+            </w:r>
+          </w:p>
+        </w:tc>
+        <w:tc>
+          <w:tcPr>
+            <w:tcW w:type="dxa" w:w="2910"/>
+            <w:shd w:fill="F4F7F6" w:val="clear"/>
+            <w:tcMar>
+              <w:top w:type="dxa" w:w="60"/>
+              <w:left w:type="dxa" w:w="100"/>
+              <w:bottom w:type="dxa" w:w="60"/>
+              <w:right w:type="dxa" w:w="100"/>
+            </w:tcMar>
+          </w:tcPr>
+          <w:p>
+            <w:pPr>
+              <w:spacing w:after="0" w:line="240"/>
+              <w:jc w:val="left"/>
+            </w:pPr>
+            <w:r>
+              <w:rPr>
+                <w:rFonts w:ascii="Consolas" w:cs="Consolas" w:eastAsia="Consolas" w:hAnsi="Consolas"/>
+                <w:b w:val="false"/>
+                <w:bCs w:val="false"/>
+                <w:sz w:val="16"/>
+                <w:szCs w:val="16"/>
+              </w:rPr>
+              <w:t xml:space="preserve">NavegacionPorNotificaciones</w:t>
+            </w:r>
+          </w:p>
+        </w:tc>
+      </w:tr>
     </w:tbl>
     <w:p>
       <w:pPr>
@@ -5776,7 +6066,7 @@
           <w:sz w:val="24"/>
           <w:szCs w:val="24"/>
         </w:rPr>
-        <w:t xml:space="preserve">Los treinta requerimientos están implementados y verificados. La entrega efectiva del RF-28 en un teléfono real depende de configurar el identificador de proyecto de Expo, que es un paso de despliegue y no de desarrollo: la lógica de envío, el reparto por lotes y la baja de dispositivos desinstalados están cubiertos por pruebas automatizadas.</w:t>
+        <w:t xml:space="preserve">Los treinta y dos requerimientos están implementados y verificados. Corresponde precisar el alcance del RF-28: la lógica de envío, el reparto por lotes y la baja de dispositivos desinstalados están cubiertas por pruebas automatizadas, y el adaptador se ejerció contra el servicio real. La entrega en un teléfono depende de dos pasos de despliegue ajenos al desarrollo: configurar el identificador de proyecto de Expo y generar una compilación de desarrollo, ya que desde la versión 53 del SDK la aplicación Expo Go no admite notificaciones remotas.</w:t>
       </w:r>
     </w:p>
     <w:p>
@@ -7227,7 +7517,7 @@
                 <w:sz w:val="18"/>
                 <w:szCs w:val="18"/>
               </w:rPr>
-              <w:t xml:space="preserve">Siete pruebas automatizadas de control de acceso y consentimiento. Verificado.</w:t>
+              <w:t xml:space="preserve">Doce pruebas automatizadas de control de acceso y consentimiento. Verificado.</w:t>
             </w:r>
           </w:p>
         </w:tc>
@@ -7929,7 +8219,7 @@
                 <w:sz w:val="18"/>
                 <w:szCs w:val="18"/>
               </w:rPr>
-              <w:t xml:space="preserve">99 pruebas en menos de dos segundos. Verificado.</w:t>
+              <w:t xml:space="preserve">104 pruebas en menos de dos segundos. Verificado.</w:t>
             </w:r>
           </w:p>
         </w:tc>

</xml_diff>

<commit_message>
Notificaciones verificadas en dispositivo, permisos granulares y edicion de medicamentos
</commit_message>
<xml_diff>
--- a/docs/Chronova-Requerimientos.docx
+++ b/docs/Chronova-Requerimientos.docx
@@ -2480,7 +2480,7 @@
                 <w:sz w:val="18"/>
                 <w:szCs w:val="18"/>
               </w:rPr>
-              <w:t xml:space="preserve">El sistema debe permitir modificar los datos de un medicamento existente.</w:t>
+              <w:t xml:space="preserve">El sistema debe permitir modificar los datos de un medicamento existente, conservando su historial de tomas.</w:t>
             </w:r>
           </w:p>
         </w:tc>
@@ -4945,7 +4945,7 @@
                 <w:sz w:val="18"/>
                 <w:szCs w:val="18"/>
               </w:rPr>
-              <w:t xml:space="preserve">El sistema debe permitir al paciente definir qué puede hacer cada cuidador con su información.</w:t>
+              <w:t xml:space="preserve">El sistema debe permitir al paciente definir, cuidador por cuidador y permiso por permiso, qué puede hacer cada uno con su información.</w:t>
             </w:r>
           </w:p>
         </w:tc>
@@ -5001,7 +5001,7 @@
                 <w:sz w:val="18"/>
                 <w:szCs w:val="18"/>
               </w:rPr>
-              <w:t xml:space="preserve">Media</w:t>
+              <w:t xml:space="preserve">Alta</w:t>
             </w:r>
           </w:p>
         </w:tc>
@@ -6066,7 +6066,7 @@
           <w:sz w:val="24"/>
           <w:szCs w:val="24"/>
         </w:rPr>
-        <w:t xml:space="preserve">Los treinta y dos requerimientos están implementados y verificados. Corresponde precisar el alcance del RF-28: la lógica de envío, el reparto por lotes y la baja de dispositivos desinstalados están cubiertas por pruebas automatizadas, y el adaptador se ejerció contra el servicio real. La entrega en un teléfono depende de dos pasos de despliegue ajenos al desarrollo: configurar el identificador de proyecto de Expo y generar una compilación de desarrollo, ya que desde la versión 53 del SDK la aplicación Expo Go no admite notificaciones remotas.</w:t>
+        <w:t xml:space="preserve">Los treinta y dos requerimientos están implementados en el servidor, son alcanzables desde la aplicación móvil y se verificaron en ejecución. El RF-28 se comprobó de extremo a extremo sobre un dispositivo Android real, con una compilación de desarrollo del proyecto: el servidor detectó una toma vencida, envió el aviso y este llegó al teléfono de la cuidadora, que al tocarlo abrió directamente la información de esa paciente. Conviene dejar constancia de que esa comprobación exige dicha compilación, porque desde la versión 53 del SDK la aplicación Expo Go no admite notificaciones remotas.</w:t>
       </w:r>
     </w:p>
     <w:p>
@@ -6319,7 +6319,7 @@
                 <w:sz w:val="18"/>
                 <w:szCs w:val="18"/>
               </w:rPr>
-              <w:t xml:space="preserve">El texto base de la interfaz no será inferior a 18 puntos y el paciente podrá ampliarlo hasta un 145 %.</w:t>
+              <w:t xml:space="preserve">El texto de cuerpo no será inferior a 18 puntos y el paciente podrá ampliar toda la interfaz hasta un 145 %.</w:t>
             </w:r>
           </w:p>
         </w:tc>
@@ -6436,7 +6436,7 @@
                 <w:sz w:val="18"/>
                 <w:szCs w:val="18"/>
               </w:rPr>
-              <w:t xml:space="preserve">Todo par de texto y fondo cumplirá la relación de contraste 4.5:1 que exige la norma WCAG 2.1 nivel AA.</w:t>
+              <w:t xml:space="preserve">Todo par de texto y fondo usado en la interfaz cumplirá la relación de contraste 4.5:1 que exige la norma WCAG 2.1 nivel AA.</w:t>
             </w:r>
           </w:p>
         </w:tc>
@@ -7021,7 +7021,7 @@
                 <w:sz w:val="18"/>
                 <w:szCs w:val="18"/>
               </w:rPr>
-              <w:t xml:space="preserve">Las contraseñas se almacenarán cifradas con bcrypt (factor de costo 10) y nunca en texto plano.</w:t>
+              <w:t xml:space="preserve">Las contraseñas se almacenarán cifradas con bcrypt —implementación bcryptjs, factor de costo 10— y nunca en texto plano.</w:t>
             </w:r>
           </w:p>
         </w:tc>
@@ -7255,7 +7255,7 @@
                 <w:sz w:val="18"/>
                 <w:szCs w:val="18"/>
               </w:rPr>
-              <w:t xml:space="preserve">Las sesiones se gestionarán con tokens firmados y expiración máxima de siete días.</w:t>
+              <w:t xml:space="preserve">Las sesiones se gestionarán con tokens firmados y expiración de siete días por defecto, configurable.</w:t>
             </w:r>
           </w:p>
         </w:tc>
@@ -7517,7 +7517,7 @@
                 <w:sz w:val="18"/>
                 <w:szCs w:val="18"/>
               </w:rPr>
-              <w:t xml:space="preserve">Doce pruebas automatizadas de control de acceso y consentimiento. Verificado.</w:t>
+              <w:t xml:space="preserve">Veinte pruebas automatizadas de control de acceso y consentimiento, repartidas entre casosDeUso.test.ts y dominio.test.ts. Verificado.</w:t>
             </w:r>
           </w:p>
         </w:tc>
@@ -7634,7 +7634,7 @@
                 <w:sz w:val="18"/>
                 <w:szCs w:val="18"/>
               </w:rPr>
-              <w:t xml:space="preserve">Medido entre 20 y 75 ms con 25 peticiones simultáneas contra PostgreSQL 16. Verificado.</w:t>
+              <w:t xml:space="preserve">La agenda se resuelve con consultas indexadas por paciente y fecha. Medida en desarrollo por debajo de 100 ms; falta una prueba de carga reproducible incluida en el repositorio. Parcial.</w:t>
             </w:r>
           </w:p>
         </w:tc>
@@ -7751,7 +7751,7 @@
                 <w:sz w:val="18"/>
                 <w:szCs w:val="18"/>
               </w:rPr>
-              <w:t xml:space="preserve">25 peticiones simultáneas: cero duplicados y cero errores. Verificado.</w:t>
+              <w:t xml:space="preserve">Prueba automatizada de consultas simultáneas a la agenda, más la restricción UNIQUE y el ON CONFLICT DO NOTHING que la respaldan en la base de datos. Verificado.</w:t>
             </w:r>
           </w:p>
         </w:tc>
@@ -7868,7 +7868,7 @@
                 <w:sz w:val="18"/>
                 <w:szCs w:val="18"/>
               </w:rPr>
-              <w:t xml:space="preserve">Las alarmas se programan localmente en el teléfono. Verificado por diseño.</w:t>
+              <w:t xml:space="preserve">Las alarmas se programan localmente en el teléfono, con siete días de antelación, de modo que suenan sin conexión y sin necesidad de abrir la aplicación. Verificado por diseño y en dispositivo.</w:t>
             </w:r>
           </w:p>
         </w:tc>
@@ -8219,7 +8219,7 @@
                 <w:sz w:val="18"/>
                 <w:szCs w:val="18"/>
               </w:rPr>
-              <w:t xml:space="preserve">104 pruebas en menos de dos segundos. Verificado.</w:t>
+              <w:t xml:space="preserve">114 pruebas en menos de dos segundos. Verificado.</w:t>
             </w:r>
           </w:p>
         </w:tc>
@@ -8570,7 +8570,7 @@
                 <w:sz w:val="18"/>
                 <w:szCs w:val="18"/>
               </w:rPr>
-              <w:t xml:space="preserve">Ejecución en dispositivo y verificación de tipos y compilación. Verificado.</w:t>
+              <w:t xml:space="preserve">Ejecución sobre un dispositivo Android real mediante una compilación de desarrollo, más verificación de tipos y compilación del backend. Verificado.</w:t>
             </w:r>
           </w:p>
         </w:tc>
@@ -8687,7 +8687,7 @@
                 <w:sz w:val="18"/>
                 <w:szCs w:val="18"/>
               </w:rPr>
-              <w:t xml:space="preserve">Verificado con el servicio inaccesible: las cuatro tomas vencidas se cerraron igual y el fallo solo quedó en el registro. Verificado.</w:t>
+              <w:t xml:space="preserve">Prueba automatizada con el cliente de Expo sustituido por uno que falla: el aviso se pierde, el registro de la toma no. Verificado.</w:t>
             </w:r>
           </w:p>
         </w:tc>

</xml_diff>

<commit_message>
Recuperacion de contrasena con codigo por correo
</commit_message>
<xml_diff>
--- a/docs/Chronova-Requerimientos.docx
+++ b/docs/Chronova-Requerimientos.docx
@@ -6049,6 +6049,296 @@
           </w:p>
         </w:tc>
       </w:tr>
+      <w:tr>
+        <w:trPr>
+          <w:cantSplit/>
+        </w:trPr>
+        <w:tc>
+          <w:tcPr>
+            <w:tcW w:type="dxa" w:w="700"/>
+            <w:shd w:fill="FFFFFF" w:val="clear"/>
+            <w:tcMar>
+              <w:top w:type="dxa" w:w="60"/>
+              <w:left w:type="dxa" w:w="100"/>
+              <w:bottom w:type="dxa" w:w="60"/>
+              <w:right w:type="dxa" w:w="100"/>
+            </w:tcMar>
+          </w:tcPr>
+          <w:p>
+            <w:pPr>
+              <w:spacing w:after="0" w:line="240"/>
+              <w:jc w:val="center"/>
+            </w:pPr>
+            <w:r>
+              <w:rPr>
+                <w:rFonts w:ascii="Cambria" w:cs="Cambria" w:eastAsia="Cambria" w:hAnsi="Cambria"/>
+                <w:b w:val="false"/>
+                <w:bCs w:val="false"/>
+                <w:sz w:val="18"/>
+                <w:szCs w:val="18"/>
+              </w:rPr>
+              <w:t xml:space="preserve">RF-33</w:t>
+            </w:r>
+          </w:p>
+        </w:tc>
+        <w:tc>
+          <w:tcPr>
+            <w:tcW w:type="dxa" w:w="3000"/>
+            <w:shd w:fill="FFFFFF" w:val="clear"/>
+            <w:tcMar>
+              <w:top w:type="dxa" w:w="60"/>
+              <w:left w:type="dxa" w:w="100"/>
+              <w:bottom w:type="dxa" w:w="60"/>
+              <w:right w:type="dxa" w:w="100"/>
+            </w:tcMar>
+          </w:tcPr>
+          <w:p>
+            <w:pPr>
+              <w:spacing w:after="0" w:line="240"/>
+              <w:jc w:val="left"/>
+            </w:pPr>
+            <w:r>
+              <w:rPr>
+                <w:rFonts w:ascii="Cambria" w:cs="Cambria" w:eastAsia="Cambria" w:hAnsi="Cambria"/>
+                <w:b w:val="false"/>
+                <w:bCs w:val="false"/>
+                <w:sz w:val="18"/>
+                <w:szCs w:val="18"/>
+              </w:rPr>
+              <w:t xml:space="preserve">El sistema debe permitir recuperar el acceso a una cuenta cuyo titular olvidó la contraseña, mediante un código enviado a su correo.</w:t>
+            </w:r>
+          </w:p>
+        </w:tc>
+        <w:tc>
+          <w:tcPr>
+            <w:tcW w:type="dxa" w:w="1150"/>
+            <w:shd w:fill="FFFFFF" w:val="clear"/>
+            <w:tcMar>
+              <w:top w:type="dxa" w:w="60"/>
+              <w:left w:type="dxa" w:w="100"/>
+              <w:bottom w:type="dxa" w:w="60"/>
+              <w:right w:type="dxa" w:w="100"/>
+            </w:tcMar>
+          </w:tcPr>
+          <w:p>
+            <w:pPr>
+              <w:spacing w:after="0" w:line="240"/>
+              <w:jc w:val="left"/>
+            </w:pPr>
+            <w:r>
+              <w:rPr>
+                <w:rFonts w:ascii="Cambria" w:cs="Cambria" w:eastAsia="Cambria" w:hAnsi="Cambria"/>
+                <w:b w:val="false"/>
+                <w:bCs w:val="false"/>
+                <w:sz w:val="18"/>
+                <w:szCs w:val="18"/>
+              </w:rPr>
+              <w:t xml:space="preserve">Ambos</w:t>
+            </w:r>
+          </w:p>
+        </w:tc>
+        <w:tc>
+          <w:tcPr>
+            <w:tcW w:type="dxa" w:w="1000"/>
+            <w:shd w:fill="FFFFFF" w:val="clear"/>
+            <w:tcMar>
+              <w:top w:type="dxa" w:w="60"/>
+              <w:left w:type="dxa" w:w="100"/>
+              <w:bottom w:type="dxa" w:w="60"/>
+              <w:right w:type="dxa" w:w="100"/>
+            </w:tcMar>
+          </w:tcPr>
+          <w:p>
+            <w:pPr>
+              <w:spacing w:after="0" w:line="240"/>
+              <w:jc w:val="center"/>
+            </w:pPr>
+            <w:r>
+              <w:rPr>
+                <w:rFonts w:ascii="Cambria" w:cs="Cambria" w:eastAsia="Cambria" w:hAnsi="Cambria"/>
+                <w:b w:val="false"/>
+                <w:bCs w:val="false"/>
+                <w:sz w:val="18"/>
+                <w:szCs w:val="18"/>
+              </w:rPr>
+              <w:t xml:space="preserve">Alta</w:t>
+            </w:r>
+          </w:p>
+        </w:tc>
+        <w:tc>
+          <w:tcPr>
+            <w:tcW w:type="dxa" w:w="2910"/>
+            <w:shd w:fill="FFFFFF" w:val="clear"/>
+            <w:tcMar>
+              <w:top w:type="dxa" w:w="60"/>
+              <w:left w:type="dxa" w:w="100"/>
+              <w:bottom w:type="dxa" w:w="60"/>
+              <w:right w:type="dxa" w:w="100"/>
+            </w:tcMar>
+          </w:tcPr>
+          <w:p>
+            <w:pPr>
+              <w:spacing w:after="0" w:line="240"/>
+              <w:jc w:val="left"/>
+            </w:pPr>
+            <w:r>
+              <w:rPr>
+                <w:rFonts w:ascii="Consolas" w:cs="Consolas" w:eastAsia="Consolas" w:hAnsi="Consolas"/>
+                <w:b w:val="false"/>
+                <w:bCs w:val="false"/>
+                <w:sz w:val="16"/>
+                <w:szCs w:val="16"/>
+              </w:rPr>
+              <w:t xml:space="preserve">SolicitarRecuperacion</w:t>
+            </w:r>
+          </w:p>
+        </w:tc>
+      </w:tr>
+      <w:tr>
+        <w:trPr>
+          <w:cantSplit/>
+        </w:trPr>
+        <w:tc>
+          <w:tcPr>
+            <w:tcW w:type="dxa" w:w="700"/>
+            <w:shd w:fill="F4F7F6" w:val="clear"/>
+            <w:tcMar>
+              <w:top w:type="dxa" w:w="60"/>
+              <w:left w:type="dxa" w:w="100"/>
+              <w:bottom w:type="dxa" w:w="60"/>
+              <w:right w:type="dxa" w:w="100"/>
+            </w:tcMar>
+          </w:tcPr>
+          <w:p>
+            <w:pPr>
+              <w:spacing w:after="0" w:line="240"/>
+              <w:jc w:val="center"/>
+            </w:pPr>
+            <w:r>
+              <w:rPr>
+                <w:rFonts w:ascii="Cambria" w:cs="Cambria" w:eastAsia="Cambria" w:hAnsi="Cambria"/>
+                <w:b w:val="false"/>
+                <w:bCs w:val="false"/>
+                <w:sz w:val="18"/>
+                <w:szCs w:val="18"/>
+              </w:rPr>
+              <w:t xml:space="preserve">RF-34</w:t>
+            </w:r>
+          </w:p>
+        </w:tc>
+        <w:tc>
+          <w:tcPr>
+            <w:tcW w:type="dxa" w:w="3000"/>
+            <w:shd w:fill="F4F7F6" w:val="clear"/>
+            <w:tcMar>
+              <w:top w:type="dxa" w:w="60"/>
+              <w:left w:type="dxa" w:w="100"/>
+              <w:bottom w:type="dxa" w:w="60"/>
+              <w:right w:type="dxa" w:w="100"/>
+            </w:tcMar>
+          </w:tcPr>
+          <w:p>
+            <w:pPr>
+              <w:spacing w:after="0" w:line="240"/>
+              <w:jc w:val="left"/>
+            </w:pPr>
+            <w:r>
+              <w:rPr>
+                <w:rFonts w:ascii="Cambria" w:cs="Cambria" w:eastAsia="Cambria" w:hAnsi="Cambria"/>
+                <w:b w:val="false"/>
+                <w:bCs w:val="false"/>
+                <w:sz w:val="18"/>
+                <w:szCs w:val="18"/>
+              </w:rPr>
+              <w:t xml:space="preserve">El sistema debe permitir establecer una contraseña nueva presentando ese código, que caducará, servirá una sola vez y admitirá un número limitado de intentos.</w:t>
+            </w:r>
+          </w:p>
+        </w:tc>
+        <w:tc>
+          <w:tcPr>
+            <w:tcW w:type="dxa" w:w="1150"/>
+            <w:shd w:fill="F4F7F6" w:val="clear"/>
+            <w:tcMar>
+              <w:top w:type="dxa" w:w="60"/>
+              <w:left w:type="dxa" w:w="100"/>
+              <w:bottom w:type="dxa" w:w="60"/>
+              <w:right w:type="dxa" w:w="100"/>
+            </w:tcMar>
+          </w:tcPr>
+          <w:p>
+            <w:pPr>
+              <w:spacing w:after="0" w:line="240"/>
+              <w:jc w:val="left"/>
+            </w:pPr>
+            <w:r>
+              <w:rPr>
+                <w:rFonts w:ascii="Cambria" w:cs="Cambria" w:eastAsia="Cambria" w:hAnsi="Cambria"/>
+                <w:b w:val="false"/>
+                <w:bCs w:val="false"/>
+                <w:sz w:val="18"/>
+                <w:szCs w:val="18"/>
+              </w:rPr>
+              <w:t xml:space="preserve">Ambos</w:t>
+            </w:r>
+          </w:p>
+        </w:tc>
+        <w:tc>
+          <w:tcPr>
+            <w:tcW w:type="dxa" w:w="1000"/>
+            <w:shd w:fill="F4F7F6" w:val="clear"/>
+            <w:tcMar>
+              <w:top w:type="dxa" w:w="60"/>
+              <w:left w:type="dxa" w:w="100"/>
+              <w:bottom w:type="dxa" w:w="60"/>
+              <w:right w:type="dxa" w:w="100"/>
+            </w:tcMar>
+          </w:tcPr>
+          <w:p>
+            <w:pPr>
+              <w:spacing w:after="0" w:line="240"/>
+              <w:jc w:val="center"/>
+            </w:pPr>
+            <w:r>
+              <w:rPr>
+                <w:rFonts w:ascii="Cambria" w:cs="Cambria" w:eastAsia="Cambria" w:hAnsi="Cambria"/>
+                <w:b w:val="false"/>
+                <w:bCs w:val="false"/>
+                <w:sz w:val="18"/>
+                <w:szCs w:val="18"/>
+              </w:rPr>
+              <w:t xml:space="preserve">Alta</w:t>
+            </w:r>
+          </w:p>
+        </w:tc>
+        <w:tc>
+          <w:tcPr>
+            <w:tcW w:type="dxa" w:w="2910"/>
+            <w:shd w:fill="F4F7F6" w:val="clear"/>
+            <w:tcMar>
+              <w:top w:type="dxa" w:w="60"/>
+              <w:left w:type="dxa" w:w="100"/>
+              <w:bottom w:type="dxa" w:w="60"/>
+              <w:right w:type="dxa" w:w="100"/>
+            </w:tcMar>
+          </w:tcPr>
+          <w:p>
+            <w:pPr>
+              <w:spacing w:after="0" w:line="240"/>
+              <w:jc w:val="left"/>
+            </w:pPr>
+            <w:r>
+              <w:rPr>
+                <w:rFonts w:ascii="Consolas" w:cs="Consolas" w:eastAsia="Consolas" w:hAnsi="Consolas"/>
+                <w:b w:val="false"/>
+                <w:bCs w:val="false"/>
+                <w:sz w:val="16"/>
+                <w:szCs w:val="16"/>
+              </w:rPr>
+              <w:t xml:space="preserve">RestablecerContrasena</w:t>
+            </w:r>
+          </w:p>
+        </w:tc>
+      </w:tr>
     </w:tbl>
     <w:p>
       <w:pPr>
@@ -6066,7 +6356,7 @@
           <w:sz w:val="24"/>
           <w:szCs w:val="24"/>
         </w:rPr>
-        <w:t xml:space="preserve">Los treinta y dos requerimientos están implementados en el servidor, son alcanzables desde la aplicación móvil y se verificaron en ejecución. El RF-28 se comprobó de extremo a extremo sobre un dispositivo Android real, con una compilación de desarrollo del proyecto: el servidor detectó una toma vencida, envió el aviso y este llegó al teléfono de la cuidadora, que al tocarlo abrió directamente la información de esa paciente. Conviene dejar constancia de que esa comprobación exige dicha compilación, porque desde la versión 53 del SDK la aplicación Expo Go no admite notificaciones remotas.</w:t>
+        <w:t xml:space="preserve">Los treinta y cuatro requerimientos están implementados en el servidor, son alcanzables desde la aplicación móvil y se verificaron en ejecución. El RF-28 se comprobó de extremo a extremo sobre un dispositivo Android real, con una compilación de desarrollo del proyecto: el servidor detectó una toma vencida, envió el aviso y este llegó al teléfono de la cuidadora, que al tocarlo abrió directamente la información de esa paciente. Conviene dejar constancia de que esa comprobación exige dicha compilación, porque desde la versión 53 del SDK la aplicación Expo Go no admite notificaciones remotas.</w:t>
       </w:r>
     </w:p>
     <w:p>
@@ -8219,7 +8509,7 @@
                 <w:sz w:val="18"/>
                 <w:szCs w:val="18"/>
               </w:rPr>
-              <w:t xml:space="preserve">114 pruebas en menos de dos segundos. Verificado.</w:t>
+              <w:t xml:space="preserve">128 pruebas en menos de dos segundos. Verificado.</w:t>
             </w:r>
           </w:p>
         </w:tc>
@@ -8805,6 +9095,357 @@
                 <w:szCs w:val="18"/>
               </w:rPr>
               <w:t xml:space="preserve">Prueba automatizada del acuse DeviceNotRegistered. Verificado.</w:t>
+            </w:r>
+          </w:p>
+        </w:tc>
+      </w:tr>
+      <w:tr>
+        <w:trPr>
+          <w:cantSplit/>
+        </w:trPr>
+        <w:tc>
+          <w:tcPr>
+            <w:tcW w:type="dxa" w:w="900"/>
+            <w:shd w:fill="FFFFFF" w:val="clear"/>
+            <w:tcMar>
+              <w:top w:type="dxa" w:w="60"/>
+              <w:left w:type="dxa" w:w="100"/>
+              <w:bottom w:type="dxa" w:w="60"/>
+              <w:right w:type="dxa" w:w="100"/>
+            </w:tcMar>
+          </w:tcPr>
+          <w:p>
+            <w:pPr>
+              <w:spacing w:after="0" w:line="240"/>
+              <w:jc w:val="center"/>
+            </w:pPr>
+            <w:r>
+              <w:rPr>
+                <w:rFonts w:ascii="Cambria" w:cs="Cambria" w:eastAsia="Cambria" w:hAnsi="Cambria"/>
+                <w:b w:val="false"/>
+                <w:bCs w:val="false"/>
+                <w:sz w:val="18"/>
+                <w:szCs w:val="18"/>
+              </w:rPr>
+              <w:t xml:space="preserve">RNF-23</w:t>
+            </w:r>
+          </w:p>
+        </w:tc>
+        <w:tc>
+          <w:tcPr>
+            <w:tcW w:type="dxa" w:w="1350"/>
+            <w:shd w:fill="FFFFFF" w:val="clear"/>
+            <w:tcMar>
+              <w:top w:type="dxa" w:w="60"/>
+              <w:left w:type="dxa" w:w="100"/>
+              <w:bottom w:type="dxa" w:w="60"/>
+              <w:right w:type="dxa" w:w="100"/>
+            </w:tcMar>
+          </w:tcPr>
+          <w:p>
+            <w:pPr>
+              <w:spacing w:after="0" w:line="240"/>
+              <w:jc w:val="left"/>
+            </w:pPr>
+            <w:r>
+              <w:rPr>
+                <w:rFonts w:ascii="Cambria" w:cs="Cambria" w:eastAsia="Cambria" w:hAnsi="Cambria"/>
+                <w:b w:val="false"/>
+                <w:bCs w:val="false"/>
+                <w:sz w:val="18"/>
+                <w:szCs w:val="18"/>
+              </w:rPr>
+              <w:t xml:space="preserve">Seguridad</w:t>
+            </w:r>
+          </w:p>
+        </w:tc>
+        <w:tc>
+          <w:tcPr>
+            <w:tcW w:type="dxa" w:w="3200"/>
+            <w:shd w:fill="FFFFFF" w:val="clear"/>
+            <w:tcMar>
+              <w:top w:type="dxa" w:w="60"/>
+              <w:left w:type="dxa" w:w="100"/>
+              <w:bottom w:type="dxa" w:w="60"/>
+              <w:right w:type="dxa" w:w="100"/>
+            </w:tcMar>
+          </w:tcPr>
+          <w:p>
+            <w:pPr>
+              <w:spacing w:after="0" w:line="240"/>
+              <w:jc w:val="left"/>
+            </w:pPr>
+            <w:r>
+              <w:rPr>
+                <w:rFonts w:ascii="Cambria" w:cs="Cambria" w:eastAsia="Cambria" w:hAnsi="Cambria"/>
+                <w:b w:val="false"/>
+                <w:bCs w:val="false"/>
+                <w:sz w:val="18"/>
+                <w:szCs w:val="18"/>
+              </w:rPr>
+              <w:t xml:space="preserve">El código de recuperación caducará a los 30 minutos, servirá una sola vez y admitirá como máximo cinco intentos.</w:t>
+            </w:r>
+          </w:p>
+        </w:tc>
+        <w:tc>
+          <w:tcPr>
+            <w:tcW w:type="dxa" w:w="3310"/>
+            <w:shd w:fill="FFFFFF" w:val="clear"/>
+            <w:tcMar>
+              <w:top w:type="dxa" w:w="60"/>
+              <w:left w:type="dxa" w:w="100"/>
+              <w:bottom w:type="dxa" w:w="60"/>
+              <w:right w:type="dxa" w:w="100"/>
+            </w:tcMar>
+          </w:tcPr>
+          <w:p>
+            <w:pPr>
+              <w:spacing w:after="0" w:line="240"/>
+              <w:jc w:val="left"/>
+            </w:pPr>
+            <w:r>
+              <w:rPr>
+                <w:rFonts w:ascii="Cambria" w:cs="Cambria" w:eastAsia="Cambria" w:hAnsi="Cambria"/>
+                <w:b w:val="false"/>
+                <w:bCs w:val="false"/>
+                <w:sz w:val="18"/>
+                <w:szCs w:val="18"/>
+              </w:rPr>
+              <w:t xml:space="preserve">Diez pruebas automatizadas de los casos de abuso: caducidad, reutilización, agotamiento de intentos y códigos de otra cuenta. Verificado.</w:t>
+            </w:r>
+          </w:p>
+        </w:tc>
+      </w:tr>
+      <w:tr>
+        <w:trPr>
+          <w:cantSplit/>
+        </w:trPr>
+        <w:tc>
+          <w:tcPr>
+            <w:tcW w:type="dxa" w:w="900"/>
+            <w:shd w:fill="F4F7F6" w:val="clear"/>
+            <w:tcMar>
+              <w:top w:type="dxa" w:w="60"/>
+              <w:left w:type="dxa" w:w="100"/>
+              <w:bottom w:type="dxa" w:w="60"/>
+              <w:right w:type="dxa" w:w="100"/>
+            </w:tcMar>
+          </w:tcPr>
+          <w:p>
+            <w:pPr>
+              <w:spacing w:after="0" w:line="240"/>
+              <w:jc w:val="center"/>
+            </w:pPr>
+            <w:r>
+              <w:rPr>
+                <w:rFonts w:ascii="Cambria" w:cs="Cambria" w:eastAsia="Cambria" w:hAnsi="Cambria"/>
+                <w:b w:val="false"/>
+                <w:bCs w:val="false"/>
+                <w:sz w:val="18"/>
+                <w:szCs w:val="18"/>
+              </w:rPr>
+              <w:t xml:space="preserve">RNF-24</w:t>
+            </w:r>
+          </w:p>
+        </w:tc>
+        <w:tc>
+          <w:tcPr>
+            <w:tcW w:type="dxa" w:w="1350"/>
+            <w:shd w:fill="F4F7F6" w:val="clear"/>
+            <w:tcMar>
+              <w:top w:type="dxa" w:w="60"/>
+              <w:left w:type="dxa" w:w="100"/>
+              <w:bottom w:type="dxa" w:w="60"/>
+              <w:right w:type="dxa" w:w="100"/>
+            </w:tcMar>
+          </w:tcPr>
+          <w:p>
+            <w:pPr>
+              <w:spacing w:after="0" w:line="240"/>
+              <w:jc w:val="left"/>
+            </w:pPr>
+            <w:r>
+              <w:rPr>
+                <w:rFonts w:ascii="Cambria" w:cs="Cambria" w:eastAsia="Cambria" w:hAnsi="Cambria"/>
+                <w:b w:val="false"/>
+                <w:bCs w:val="false"/>
+                <w:sz w:val="18"/>
+                <w:szCs w:val="18"/>
+              </w:rPr>
+              <w:t xml:space="preserve">Privacidad</w:t>
+            </w:r>
+          </w:p>
+        </w:tc>
+        <w:tc>
+          <w:tcPr>
+            <w:tcW w:type="dxa" w:w="3200"/>
+            <w:shd w:fill="F4F7F6" w:val="clear"/>
+            <w:tcMar>
+              <w:top w:type="dxa" w:w="60"/>
+              <w:left w:type="dxa" w:w="100"/>
+              <w:bottom w:type="dxa" w:w="60"/>
+              <w:right w:type="dxa" w:w="100"/>
+            </w:tcMar>
+          </w:tcPr>
+          <w:p>
+            <w:pPr>
+              <w:spacing w:after="0" w:line="240"/>
+              <w:jc w:val="left"/>
+            </w:pPr>
+            <w:r>
+              <w:rPr>
+                <w:rFonts w:ascii="Cambria" w:cs="Cambria" w:eastAsia="Cambria" w:hAnsi="Cambria"/>
+                <w:b w:val="false"/>
+                <w:bCs w:val="false"/>
+                <w:sz w:val="18"/>
+                <w:szCs w:val="18"/>
+              </w:rPr>
+              <w:t xml:space="preserve">La recuperación de contraseña no revelará si un correo está registrado.</w:t>
+            </w:r>
+          </w:p>
+        </w:tc>
+        <w:tc>
+          <w:tcPr>
+            <w:tcW w:type="dxa" w:w="3310"/>
+            <w:shd w:fill="F4F7F6" w:val="clear"/>
+            <w:tcMar>
+              <w:top w:type="dxa" w:w="60"/>
+              <w:left w:type="dxa" w:w="100"/>
+              <w:bottom w:type="dxa" w:w="60"/>
+              <w:right w:type="dxa" w:w="100"/>
+            </w:tcMar>
+          </w:tcPr>
+          <w:p>
+            <w:pPr>
+              <w:spacing w:after="0" w:line="240"/>
+              <w:jc w:val="left"/>
+            </w:pPr>
+            <w:r>
+              <w:rPr>
+                <w:rFonts w:ascii="Cambria" w:cs="Cambria" w:eastAsia="Cambria" w:hAnsi="Cambria"/>
+                <w:b w:val="false"/>
+                <w:bCs w:val="false"/>
+                <w:sz w:val="18"/>
+                <w:szCs w:val="18"/>
+              </w:rPr>
+              <w:t xml:space="preserve">Prueba automatizada que compara ambas respuestas, y verificación contra el servidor real. Verificado.</w:t>
+            </w:r>
+          </w:p>
+        </w:tc>
+      </w:tr>
+      <w:tr>
+        <w:trPr>
+          <w:cantSplit/>
+        </w:trPr>
+        <w:tc>
+          <w:tcPr>
+            <w:tcW w:type="dxa" w:w="900"/>
+            <w:shd w:fill="FFFFFF" w:val="clear"/>
+            <w:tcMar>
+              <w:top w:type="dxa" w:w="60"/>
+              <w:left w:type="dxa" w:w="100"/>
+              <w:bottom w:type="dxa" w:w="60"/>
+              <w:right w:type="dxa" w:w="100"/>
+            </w:tcMar>
+          </w:tcPr>
+          <w:p>
+            <w:pPr>
+              <w:spacing w:after="0" w:line="240"/>
+              <w:jc w:val="center"/>
+            </w:pPr>
+            <w:r>
+              <w:rPr>
+                <w:rFonts w:ascii="Cambria" w:cs="Cambria" w:eastAsia="Cambria" w:hAnsi="Cambria"/>
+                <w:b w:val="false"/>
+                <w:bCs w:val="false"/>
+                <w:sz w:val="18"/>
+                <w:szCs w:val="18"/>
+              </w:rPr>
+              <w:t xml:space="preserve">RNF-25</w:t>
+            </w:r>
+          </w:p>
+        </w:tc>
+        <w:tc>
+          <w:tcPr>
+            <w:tcW w:type="dxa" w:w="1350"/>
+            <w:shd w:fill="FFFFFF" w:val="clear"/>
+            <w:tcMar>
+              <w:top w:type="dxa" w:w="60"/>
+              <w:left w:type="dxa" w:w="100"/>
+              <w:bottom w:type="dxa" w:w="60"/>
+              <w:right w:type="dxa" w:w="100"/>
+            </w:tcMar>
+          </w:tcPr>
+          <w:p>
+            <w:pPr>
+              <w:spacing w:after="0" w:line="240"/>
+              <w:jc w:val="left"/>
+            </w:pPr>
+            <w:r>
+              <w:rPr>
+                <w:rFonts w:ascii="Cambria" w:cs="Cambria" w:eastAsia="Cambria" w:hAnsi="Cambria"/>
+                <w:b w:val="false"/>
+                <w:bCs w:val="false"/>
+                <w:sz w:val="18"/>
+                <w:szCs w:val="18"/>
+              </w:rPr>
+              <w:t xml:space="preserve">Seguridad</w:t>
+            </w:r>
+          </w:p>
+        </w:tc>
+        <w:tc>
+          <w:tcPr>
+            <w:tcW w:type="dxa" w:w="3200"/>
+            <w:shd w:fill="FFFFFF" w:val="clear"/>
+            <w:tcMar>
+              <w:top w:type="dxa" w:w="60"/>
+              <w:left w:type="dxa" w:w="100"/>
+              <w:bottom w:type="dxa" w:w="60"/>
+              <w:right w:type="dxa" w:w="100"/>
+            </w:tcMar>
+          </w:tcPr>
+          <w:p>
+            <w:pPr>
+              <w:spacing w:after="0" w:line="240"/>
+              <w:jc w:val="left"/>
+            </w:pPr>
+            <w:r>
+              <w:rPr>
+                <w:rFonts w:ascii="Cambria" w:cs="Cambria" w:eastAsia="Cambria" w:hAnsi="Cambria"/>
+                <w:b w:val="false"/>
+                <w:bCs w:val="false"/>
+                <w:sz w:val="18"/>
+                <w:szCs w:val="18"/>
+              </w:rPr>
+              <w:t xml:space="preserve">El código de recuperación se almacenará cifrado, nunca en texto plano.</w:t>
+            </w:r>
+          </w:p>
+        </w:tc>
+        <w:tc>
+          <w:tcPr>
+            <w:tcW w:type="dxa" w:w="3310"/>
+            <w:shd w:fill="FFFFFF" w:val="clear"/>
+            <w:tcMar>
+              <w:top w:type="dxa" w:w="60"/>
+              <w:left w:type="dxa" w:w="100"/>
+              <w:bottom w:type="dxa" w:w="60"/>
+              <w:right w:type="dxa" w:w="100"/>
+            </w:tcMar>
+          </w:tcPr>
+          <w:p>
+            <w:pPr>
+              <w:spacing w:after="0" w:line="240"/>
+              <w:jc w:val="left"/>
+            </w:pPr>
+            <w:r>
+              <w:rPr>
+                <w:rFonts w:ascii="Cambria" w:cs="Cambria" w:eastAsia="Cambria" w:hAnsi="Cambria"/>
+                <w:b w:val="false"/>
+                <w:bCs w:val="false"/>
+                <w:sz w:val="18"/>
+                <w:szCs w:val="18"/>
+              </w:rPr>
+              <w:t xml:space="preserve">Prueba automatizada sobre el valor guardado en el repositorio. Verificado.</w:t>
             </w:r>
           </w:p>
         </w:tc>

</xml_diff>

<commit_message>
Rediseno de la interfaz y correcciones de documentacion
</commit_message>
<xml_diff>
--- a/docs/Chronova-Requerimientos.docx
+++ b/docs/Chronova-Requerimientos.docx
@@ -12,7 +12,7 @@
           <w:rFonts w:ascii="Cambria" w:cs="Cambria" w:eastAsia="Cambria" w:hAnsi="Cambria"/>
           <w:b/>
           <w:bCs/>
-          <w:color w:val="0E6E62"/>
+          <w:color w:val="0B5563"/>
           <w:sz w:val="32"/>
           <w:szCs w:val="32"/>
         </w:rPr>
@@ -144,7 +144,7 @@
         <w:tc>
           <w:tcPr>
             <w:tcW w:type="dxa" w:w="1700"/>
-            <w:shd w:fill="DDEDE9" w:val="clear"/>
+            <w:shd w:fill="E3EFF2" w:val="clear"/>
             <w:tcMar>
               <w:top w:type="dxa" w:w="60"/>
               <w:left w:type="dxa" w:w="100"/>
@@ -172,7 +172,7 @@
         <w:tc>
           <w:tcPr>
             <w:tcW w:type="dxa" w:w="3400"/>
-            <w:shd w:fill="DDEDE9" w:val="clear"/>
+            <w:shd w:fill="E3EFF2" w:val="clear"/>
             <w:tcMar>
               <w:top w:type="dxa" w:w="60"/>
               <w:left w:type="dxa" w:w="100"/>
@@ -200,7 +200,7 @@
         <w:tc>
           <w:tcPr>
             <w:tcW w:type="dxa" w:w="3660"/>
-            <w:shd w:fill="DDEDE9" w:val="clear"/>
+            <w:shd w:fill="E3EFF2" w:val="clear"/>
             <w:tcMar>
               <w:top w:type="dxa" w:w="60"/>
               <w:left w:type="dxa" w:w="100"/>
@@ -322,7 +322,7 @@
         <w:tc>
           <w:tcPr>
             <w:tcW w:type="dxa" w:w="1700"/>
-            <w:shd w:fill="F4F7F6" w:val="clear"/>
+            <w:shd w:fill="F7F9FA" w:val="clear"/>
             <w:tcMar>
               <w:top w:type="dxa" w:w="60"/>
               <w:left w:type="dxa" w:w="100"/>
@@ -350,7 +350,7 @@
         <w:tc>
           <w:tcPr>
             <w:tcW w:type="dxa" w:w="3400"/>
-            <w:shd w:fill="F4F7F6" w:val="clear"/>
+            <w:shd w:fill="F7F9FA" w:val="clear"/>
             <w:tcMar>
               <w:top w:type="dxa" w:w="60"/>
               <w:left w:type="dxa" w:w="100"/>
@@ -378,7 +378,7 @@
         <w:tc>
           <w:tcPr>
             <w:tcW w:type="dxa" w:w="3660"/>
-            <w:shd w:fill="F4F7F6" w:val="clear"/>
+            <w:shd w:fill="F7F9FA" w:val="clear"/>
             <w:tcMar>
               <w:top w:type="dxa" w:w="60"/>
               <w:left w:type="dxa" w:w="100"/>
@@ -578,7 +578,7 @@
         <w:tc>
           <w:tcPr>
             <w:tcW w:type="dxa" w:w="2000"/>
-            <w:shd w:fill="DDEDE9" w:val="clear"/>
+            <w:shd w:fill="E3EFF2" w:val="clear"/>
             <w:tcMar>
               <w:top w:type="dxa" w:w="60"/>
               <w:left w:type="dxa" w:w="100"/>
@@ -606,7 +606,7 @@
         <w:tc>
           <w:tcPr>
             <w:tcW w:type="dxa" w:w="1400"/>
-            <w:shd w:fill="DDEDE9" w:val="clear"/>
+            <w:shd w:fill="E3EFF2" w:val="clear"/>
             <w:tcMar>
               <w:top w:type="dxa" w:w="60"/>
               <w:left w:type="dxa" w:w="100"/>
@@ -634,7 +634,7 @@
         <w:tc>
           <w:tcPr>
             <w:tcW w:type="dxa" w:w="5360"/>
-            <w:shd w:fill="DDEDE9" w:val="clear"/>
+            <w:shd w:fill="E3EFF2" w:val="clear"/>
             <w:tcMar>
               <w:top w:type="dxa" w:w="60"/>
               <w:left w:type="dxa" w:w="100"/>
@@ -756,7 +756,7 @@
         <w:tc>
           <w:tcPr>
             <w:tcW w:type="dxa" w:w="2000"/>
-            <w:shd w:fill="F4F7F6" w:val="clear"/>
+            <w:shd w:fill="F7F9FA" w:val="clear"/>
             <w:tcMar>
               <w:top w:type="dxa" w:w="60"/>
               <w:left w:type="dxa" w:w="100"/>
@@ -784,7 +784,7 @@
         <w:tc>
           <w:tcPr>
             <w:tcW w:type="dxa" w:w="1400"/>
-            <w:shd w:fill="F4F7F6" w:val="clear"/>
+            <w:shd w:fill="F7F9FA" w:val="clear"/>
             <w:tcMar>
               <w:top w:type="dxa" w:w="60"/>
               <w:left w:type="dxa" w:w="100"/>
@@ -812,7 +812,7 @@
         <w:tc>
           <w:tcPr>
             <w:tcW w:type="dxa" w:w="5360"/>
-            <w:shd w:fill="F4F7F6" w:val="clear"/>
+            <w:shd w:fill="F7F9FA" w:val="clear"/>
             <w:tcMar>
               <w:top w:type="dxa" w:w="60"/>
               <w:left w:type="dxa" w:w="100"/>
@@ -934,7 +934,7 @@
         <w:tc>
           <w:tcPr>
             <w:tcW w:type="dxa" w:w="2000"/>
-            <w:shd w:fill="F4F7F6" w:val="clear"/>
+            <w:shd w:fill="F7F9FA" w:val="clear"/>
             <w:tcMar>
               <w:top w:type="dxa" w:w="60"/>
               <w:left w:type="dxa" w:w="100"/>
@@ -962,7 +962,7 @@
         <w:tc>
           <w:tcPr>
             <w:tcW w:type="dxa" w:w="1400"/>
-            <w:shd w:fill="F4F7F6" w:val="clear"/>
+            <w:shd w:fill="F7F9FA" w:val="clear"/>
             <w:tcMar>
               <w:top w:type="dxa" w:w="60"/>
               <w:left w:type="dxa" w:w="100"/>
@@ -990,7 +990,7 @@
         <w:tc>
           <w:tcPr>
             <w:tcW w:type="dxa" w:w="5360"/>
-            <w:shd w:fill="F4F7F6" w:val="clear"/>
+            <w:shd w:fill="F7F9FA" w:val="clear"/>
             <w:tcMar>
               <w:top w:type="dxa" w:w="60"/>
               <w:left w:type="dxa" w:w="100"/>
@@ -1112,7 +1112,7 @@
         <w:tc>
           <w:tcPr>
             <w:tcW w:type="dxa" w:w="2000"/>
-            <w:shd w:fill="F4F7F6" w:val="clear"/>
+            <w:shd w:fill="F7F9FA" w:val="clear"/>
             <w:tcMar>
               <w:top w:type="dxa" w:w="60"/>
               <w:left w:type="dxa" w:w="100"/>
@@ -1140,7 +1140,7 @@
         <w:tc>
           <w:tcPr>
             <w:tcW w:type="dxa" w:w="1400"/>
-            <w:shd w:fill="F4F7F6" w:val="clear"/>
+            <w:shd w:fill="F7F9FA" w:val="clear"/>
             <w:tcMar>
               <w:top w:type="dxa" w:w="60"/>
               <w:left w:type="dxa" w:w="100"/>
@@ -1168,7 +1168,7 @@
         <w:tc>
           <w:tcPr>
             <w:tcW w:type="dxa" w:w="5360"/>
-            <w:shd w:fill="F4F7F6" w:val="clear"/>
+            <w:shd w:fill="F7F9FA" w:val="clear"/>
             <w:tcMar>
               <w:top w:type="dxa" w:w="60"/>
               <w:left w:type="dxa" w:w="100"/>
@@ -1271,7 +1271,7 @@
         <w:tc>
           <w:tcPr>
             <w:tcW w:type="dxa" w:w="700"/>
-            <w:shd w:fill="DDEDE9" w:val="clear"/>
+            <w:shd w:fill="E3EFF2" w:val="clear"/>
             <w:tcMar>
               <w:top w:type="dxa" w:w="60"/>
               <w:left w:type="dxa" w:w="100"/>
@@ -1299,7 +1299,7 @@
         <w:tc>
           <w:tcPr>
             <w:tcW w:type="dxa" w:w="3000"/>
-            <w:shd w:fill="DDEDE9" w:val="clear"/>
+            <w:shd w:fill="E3EFF2" w:val="clear"/>
             <w:tcMar>
               <w:top w:type="dxa" w:w="60"/>
               <w:left w:type="dxa" w:w="100"/>
@@ -1327,7 +1327,7 @@
         <w:tc>
           <w:tcPr>
             <w:tcW w:type="dxa" w:w="1150"/>
-            <w:shd w:fill="DDEDE9" w:val="clear"/>
+            <w:shd w:fill="E3EFF2" w:val="clear"/>
             <w:tcMar>
               <w:top w:type="dxa" w:w="60"/>
               <w:left w:type="dxa" w:w="100"/>
@@ -1355,7 +1355,7 @@
         <w:tc>
           <w:tcPr>
             <w:tcW w:type="dxa" w:w="1000"/>
-            <w:shd w:fill="DDEDE9" w:val="clear"/>
+            <w:shd w:fill="E3EFF2" w:val="clear"/>
             <w:tcMar>
               <w:top w:type="dxa" w:w="60"/>
               <w:left w:type="dxa" w:w="100"/>
@@ -1383,7 +1383,7 @@
         <w:tc>
           <w:tcPr>
             <w:tcW w:type="dxa" w:w="2910"/>
-            <w:shd w:fill="DDEDE9" w:val="clear"/>
+            <w:shd w:fill="E3EFF2" w:val="clear"/>
             <w:tcMar>
               <w:top w:type="dxa" w:w="60"/>
               <w:left w:type="dxa" w:w="100"/>
@@ -1561,7 +1561,7 @@
         <w:tc>
           <w:tcPr>
             <w:tcW w:type="dxa" w:w="700"/>
-            <w:shd w:fill="F4F7F6" w:val="clear"/>
+            <w:shd w:fill="F7F9FA" w:val="clear"/>
             <w:tcMar>
               <w:top w:type="dxa" w:w="60"/>
               <w:left w:type="dxa" w:w="100"/>
@@ -1589,7 +1589,7 @@
         <w:tc>
           <w:tcPr>
             <w:tcW w:type="dxa" w:w="3000"/>
-            <w:shd w:fill="F4F7F6" w:val="clear"/>
+            <w:shd w:fill="F7F9FA" w:val="clear"/>
             <w:tcMar>
               <w:top w:type="dxa" w:w="60"/>
               <w:left w:type="dxa" w:w="100"/>
@@ -1617,7 +1617,7 @@
         <w:tc>
           <w:tcPr>
             <w:tcW w:type="dxa" w:w="1150"/>
-            <w:shd w:fill="F4F7F6" w:val="clear"/>
+            <w:shd w:fill="F7F9FA" w:val="clear"/>
             <w:tcMar>
               <w:top w:type="dxa" w:w="60"/>
               <w:left w:type="dxa" w:w="100"/>
@@ -1645,7 +1645,7 @@
         <w:tc>
           <w:tcPr>
             <w:tcW w:type="dxa" w:w="1000"/>
-            <w:shd w:fill="F4F7F6" w:val="clear"/>
+            <w:shd w:fill="F7F9FA" w:val="clear"/>
             <w:tcMar>
               <w:top w:type="dxa" w:w="60"/>
               <w:left w:type="dxa" w:w="100"/>
@@ -1673,7 +1673,7 @@
         <w:tc>
           <w:tcPr>
             <w:tcW w:type="dxa" w:w="2910"/>
-            <w:shd w:fill="F4F7F6" w:val="clear"/>
+            <w:shd w:fill="F7F9FA" w:val="clear"/>
             <w:tcMar>
               <w:top w:type="dxa" w:w="60"/>
               <w:left w:type="dxa" w:w="100"/>
@@ -1851,7 +1851,7 @@
         <w:tc>
           <w:tcPr>
             <w:tcW w:type="dxa" w:w="700"/>
-            <w:shd w:fill="F4F7F6" w:val="clear"/>
+            <w:shd w:fill="F7F9FA" w:val="clear"/>
             <w:tcMar>
               <w:top w:type="dxa" w:w="60"/>
               <w:left w:type="dxa" w:w="100"/>
@@ -1879,7 +1879,7 @@
         <w:tc>
           <w:tcPr>
             <w:tcW w:type="dxa" w:w="3000"/>
-            <w:shd w:fill="F4F7F6" w:val="clear"/>
+            <w:shd w:fill="F7F9FA" w:val="clear"/>
             <w:tcMar>
               <w:top w:type="dxa" w:w="60"/>
               <w:left w:type="dxa" w:w="100"/>
@@ -1907,7 +1907,7 @@
         <w:tc>
           <w:tcPr>
             <w:tcW w:type="dxa" w:w="1150"/>
-            <w:shd w:fill="F4F7F6" w:val="clear"/>
+            <w:shd w:fill="F7F9FA" w:val="clear"/>
             <w:tcMar>
               <w:top w:type="dxa" w:w="60"/>
               <w:left w:type="dxa" w:w="100"/>
@@ -1935,7 +1935,7 @@
         <w:tc>
           <w:tcPr>
             <w:tcW w:type="dxa" w:w="1000"/>
-            <w:shd w:fill="F4F7F6" w:val="clear"/>
+            <w:shd w:fill="F7F9FA" w:val="clear"/>
             <w:tcMar>
               <w:top w:type="dxa" w:w="60"/>
               <w:left w:type="dxa" w:w="100"/>
@@ -1963,7 +1963,7 @@
         <w:tc>
           <w:tcPr>
             <w:tcW w:type="dxa" w:w="2910"/>
-            <w:shd w:fill="F4F7F6" w:val="clear"/>
+            <w:shd w:fill="F7F9FA" w:val="clear"/>
             <w:tcMar>
               <w:top w:type="dxa" w:w="60"/>
               <w:left w:type="dxa" w:w="100"/>
@@ -2141,7 +2141,7 @@
         <w:tc>
           <w:tcPr>
             <w:tcW w:type="dxa" w:w="700"/>
-            <w:shd w:fill="F4F7F6" w:val="clear"/>
+            <w:shd w:fill="F7F9FA" w:val="clear"/>
             <w:tcMar>
               <w:top w:type="dxa" w:w="60"/>
               <w:left w:type="dxa" w:w="100"/>
@@ -2169,7 +2169,7 @@
         <w:tc>
           <w:tcPr>
             <w:tcW w:type="dxa" w:w="3000"/>
-            <w:shd w:fill="F4F7F6" w:val="clear"/>
+            <w:shd w:fill="F7F9FA" w:val="clear"/>
             <w:tcMar>
               <w:top w:type="dxa" w:w="60"/>
               <w:left w:type="dxa" w:w="100"/>
@@ -2197,7 +2197,7 @@
         <w:tc>
           <w:tcPr>
             <w:tcW w:type="dxa" w:w="1150"/>
-            <w:shd w:fill="F4F7F6" w:val="clear"/>
+            <w:shd w:fill="F7F9FA" w:val="clear"/>
             <w:tcMar>
               <w:top w:type="dxa" w:w="60"/>
               <w:left w:type="dxa" w:w="100"/>
@@ -2225,7 +2225,7 @@
         <w:tc>
           <w:tcPr>
             <w:tcW w:type="dxa" w:w="1000"/>
-            <w:shd w:fill="F4F7F6" w:val="clear"/>
+            <w:shd w:fill="F7F9FA" w:val="clear"/>
             <w:tcMar>
               <w:top w:type="dxa" w:w="60"/>
               <w:left w:type="dxa" w:w="100"/>
@@ -2253,7 +2253,7 @@
         <w:tc>
           <w:tcPr>
             <w:tcW w:type="dxa" w:w="2910"/>
-            <w:shd w:fill="F4F7F6" w:val="clear"/>
+            <w:shd w:fill="F7F9FA" w:val="clear"/>
             <w:tcMar>
               <w:top w:type="dxa" w:w="60"/>
               <w:left w:type="dxa" w:w="100"/>
@@ -2431,7 +2431,7 @@
         <w:tc>
           <w:tcPr>
             <w:tcW w:type="dxa" w:w="700"/>
-            <w:shd w:fill="F4F7F6" w:val="clear"/>
+            <w:shd w:fill="F7F9FA" w:val="clear"/>
             <w:tcMar>
               <w:top w:type="dxa" w:w="60"/>
               <w:left w:type="dxa" w:w="100"/>
@@ -2459,7 +2459,7 @@
         <w:tc>
           <w:tcPr>
             <w:tcW w:type="dxa" w:w="3000"/>
-            <w:shd w:fill="F4F7F6" w:val="clear"/>
+            <w:shd w:fill="F7F9FA" w:val="clear"/>
             <w:tcMar>
               <w:top w:type="dxa" w:w="60"/>
               <w:left w:type="dxa" w:w="100"/>
@@ -2487,7 +2487,7 @@
         <w:tc>
           <w:tcPr>
             <w:tcW w:type="dxa" w:w="1150"/>
-            <w:shd w:fill="F4F7F6" w:val="clear"/>
+            <w:shd w:fill="F7F9FA" w:val="clear"/>
             <w:tcMar>
               <w:top w:type="dxa" w:w="60"/>
               <w:left w:type="dxa" w:w="100"/>
@@ -2515,7 +2515,7 @@
         <w:tc>
           <w:tcPr>
             <w:tcW w:type="dxa" w:w="1000"/>
-            <w:shd w:fill="F4F7F6" w:val="clear"/>
+            <w:shd w:fill="F7F9FA" w:val="clear"/>
             <w:tcMar>
               <w:top w:type="dxa" w:w="60"/>
               <w:left w:type="dxa" w:w="100"/>
@@ -2543,7 +2543,7 @@
         <w:tc>
           <w:tcPr>
             <w:tcW w:type="dxa" w:w="2910"/>
-            <w:shd w:fill="F4F7F6" w:val="clear"/>
+            <w:shd w:fill="F7F9FA" w:val="clear"/>
             <w:tcMar>
               <w:top w:type="dxa" w:w="60"/>
               <w:left w:type="dxa" w:w="100"/>
@@ -2721,7 +2721,7 @@
         <w:tc>
           <w:tcPr>
             <w:tcW w:type="dxa" w:w="700"/>
-            <w:shd w:fill="F4F7F6" w:val="clear"/>
+            <w:shd w:fill="F7F9FA" w:val="clear"/>
             <w:tcMar>
               <w:top w:type="dxa" w:w="60"/>
               <w:left w:type="dxa" w:w="100"/>
@@ -2749,7 +2749,7 @@
         <w:tc>
           <w:tcPr>
             <w:tcW w:type="dxa" w:w="3000"/>
-            <w:shd w:fill="F4F7F6" w:val="clear"/>
+            <w:shd w:fill="F7F9FA" w:val="clear"/>
             <w:tcMar>
               <w:top w:type="dxa" w:w="60"/>
               <w:left w:type="dxa" w:w="100"/>
@@ -2777,7 +2777,7 @@
         <w:tc>
           <w:tcPr>
             <w:tcW w:type="dxa" w:w="1150"/>
-            <w:shd w:fill="F4F7F6" w:val="clear"/>
+            <w:shd w:fill="F7F9FA" w:val="clear"/>
             <w:tcMar>
               <w:top w:type="dxa" w:w="60"/>
               <w:left w:type="dxa" w:w="100"/>
@@ -2805,7 +2805,7 @@
         <w:tc>
           <w:tcPr>
             <w:tcW w:type="dxa" w:w="1000"/>
-            <w:shd w:fill="F4F7F6" w:val="clear"/>
+            <w:shd w:fill="F7F9FA" w:val="clear"/>
             <w:tcMar>
               <w:top w:type="dxa" w:w="60"/>
               <w:left w:type="dxa" w:w="100"/>
@@ -2833,7 +2833,7 @@
         <w:tc>
           <w:tcPr>
             <w:tcW w:type="dxa" w:w="2910"/>
-            <w:shd w:fill="F4F7F6" w:val="clear"/>
+            <w:shd w:fill="F7F9FA" w:val="clear"/>
             <w:tcMar>
               <w:top w:type="dxa" w:w="60"/>
               <w:left w:type="dxa" w:w="100"/>
@@ -3011,7 +3011,7 @@
         <w:tc>
           <w:tcPr>
             <w:tcW w:type="dxa" w:w="700"/>
-            <w:shd w:fill="F4F7F6" w:val="clear"/>
+            <w:shd w:fill="F7F9FA" w:val="clear"/>
             <w:tcMar>
               <w:top w:type="dxa" w:w="60"/>
               <w:left w:type="dxa" w:w="100"/>
@@ -3039,7 +3039,7 @@
         <w:tc>
           <w:tcPr>
             <w:tcW w:type="dxa" w:w="3000"/>
-            <w:shd w:fill="F4F7F6" w:val="clear"/>
+            <w:shd w:fill="F7F9FA" w:val="clear"/>
             <w:tcMar>
               <w:top w:type="dxa" w:w="60"/>
               <w:left w:type="dxa" w:w="100"/>
@@ -3067,7 +3067,7 @@
         <w:tc>
           <w:tcPr>
             <w:tcW w:type="dxa" w:w="1150"/>
-            <w:shd w:fill="F4F7F6" w:val="clear"/>
+            <w:shd w:fill="F7F9FA" w:val="clear"/>
             <w:tcMar>
               <w:top w:type="dxa" w:w="60"/>
               <w:left w:type="dxa" w:w="100"/>
@@ -3095,7 +3095,7 @@
         <w:tc>
           <w:tcPr>
             <w:tcW w:type="dxa" w:w="1000"/>
-            <w:shd w:fill="F4F7F6" w:val="clear"/>
+            <w:shd w:fill="F7F9FA" w:val="clear"/>
             <w:tcMar>
               <w:top w:type="dxa" w:w="60"/>
               <w:left w:type="dxa" w:w="100"/>
@@ -3123,7 +3123,7 @@
         <w:tc>
           <w:tcPr>
             <w:tcW w:type="dxa" w:w="2910"/>
-            <w:shd w:fill="F4F7F6" w:val="clear"/>
+            <w:shd w:fill="F7F9FA" w:val="clear"/>
             <w:tcMar>
               <w:top w:type="dxa" w:w="60"/>
               <w:left w:type="dxa" w:w="100"/>
@@ -3301,7 +3301,7 @@
         <w:tc>
           <w:tcPr>
             <w:tcW w:type="dxa" w:w="700"/>
-            <w:shd w:fill="F4F7F6" w:val="clear"/>
+            <w:shd w:fill="F7F9FA" w:val="clear"/>
             <w:tcMar>
               <w:top w:type="dxa" w:w="60"/>
               <w:left w:type="dxa" w:w="100"/>
@@ -3329,7 +3329,7 @@
         <w:tc>
           <w:tcPr>
             <w:tcW w:type="dxa" w:w="3000"/>
-            <w:shd w:fill="F4F7F6" w:val="clear"/>
+            <w:shd w:fill="F7F9FA" w:val="clear"/>
             <w:tcMar>
               <w:top w:type="dxa" w:w="60"/>
               <w:left w:type="dxa" w:w="100"/>
@@ -3357,7 +3357,7 @@
         <w:tc>
           <w:tcPr>
             <w:tcW w:type="dxa" w:w="1150"/>
-            <w:shd w:fill="F4F7F6" w:val="clear"/>
+            <w:shd w:fill="F7F9FA" w:val="clear"/>
             <w:tcMar>
               <w:top w:type="dxa" w:w="60"/>
               <w:left w:type="dxa" w:w="100"/>
@@ -3385,7 +3385,7 @@
         <w:tc>
           <w:tcPr>
             <w:tcW w:type="dxa" w:w="1000"/>
-            <w:shd w:fill="F4F7F6" w:val="clear"/>
+            <w:shd w:fill="F7F9FA" w:val="clear"/>
             <w:tcMar>
               <w:top w:type="dxa" w:w="60"/>
               <w:left w:type="dxa" w:w="100"/>
@@ -3413,7 +3413,7 @@
         <w:tc>
           <w:tcPr>
             <w:tcW w:type="dxa" w:w="2910"/>
-            <w:shd w:fill="F4F7F6" w:val="clear"/>
+            <w:shd w:fill="F7F9FA" w:val="clear"/>
             <w:tcMar>
               <w:top w:type="dxa" w:w="60"/>
               <w:left w:type="dxa" w:w="100"/>
@@ -3591,7 +3591,7 @@
         <w:tc>
           <w:tcPr>
             <w:tcW w:type="dxa" w:w="700"/>
-            <w:shd w:fill="F4F7F6" w:val="clear"/>
+            <w:shd w:fill="F7F9FA" w:val="clear"/>
             <w:tcMar>
               <w:top w:type="dxa" w:w="60"/>
               <w:left w:type="dxa" w:w="100"/>
@@ -3619,7 +3619,7 @@
         <w:tc>
           <w:tcPr>
             <w:tcW w:type="dxa" w:w="3000"/>
-            <w:shd w:fill="F4F7F6" w:val="clear"/>
+            <w:shd w:fill="F7F9FA" w:val="clear"/>
             <w:tcMar>
               <w:top w:type="dxa" w:w="60"/>
               <w:left w:type="dxa" w:w="100"/>
@@ -3647,7 +3647,7 @@
         <w:tc>
           <w:tcPr>
             <w:tcW w:type="dxa" w:w="1150"/>
-            <w:shd w:fill="F4F7F6" w:val="clear"/>
+            <w:shd w:fill="F7F9FA" w:val="clear"/>
             <w:tcMar>
               <w:top w:type="dxa" w:w="60"/>
               <w:left w:type="dxa" w:w="100"/>
@@ -3675,7 +3675,7 @@
         <w:tc>
           <w:tcPr>
             <w:tcW w:type="dxa" w:w="1000"/>
-            <w:shd w:fill="F4F7F6" w:val="clear"/>
+            <w:shd w:fill="F7F9FA" w:val="clear"/>
             <w:tcMar>
               <w:top w:type="dxa" w:w="60"/>
               <w:left w:type="dxa" w:w="100"/>
@@ -3703,7 +3703,7 @@
         <w:tc>
           <w:tcPr>
             <w:tcW w:type="dxa" w:w="2910"/>
-            <w:shd w:fill="F4F7F6" w:val="clear"/>
+            <w:shd w:fill="F7F9FA" w:val="clear"/>
             <w:tcMar>
               <w:top w:type="dxa" w:w="60"/>
               <w:left w:type="dxa" w:w="100"/>
@@ -3881,7 +3881,7 @@
         <w:tc>
           <w:tcPr>
             <w:tcW w:type="dxa" w:w="700"/>
-            <w:shd w:fill="F4F7F6" w:val="clear"/>
+            <w:shd w:fill="F7F9FA" w:val="clear"/>
             <w:tcMar>
               <w:top w:type="dxa" w:w="60"/>
               <w:left w:type="dxa" w:w="100"/>
@@ -3909,7 +3909,7 @@
         <w:tc>
           <w:tcPr>
             <w:tcW w:type="dxa" w:w="3000"/>
-            <w:shd w:fill="F4F7F6" w:val="clear"/>
+            <w:shd w:fill="F7F9FA" w:val="clear"/>
             <w:tcMar>
               <w:top w:type="dxa" w:w="60"/>
               <w:left w:type="dxa" w:w="100"/>
@@ -3937,7 +3937,7 @@
         <w:tc>
           <w:tcPr>
             <w:tcW w:type="dxa" w:w="1150"/>
-            <w:shd w:fill="F4F7F6" w:val="clear"/>
+            <w:shd w:fill="F7F9FA" w:val="clear"/>
             <w:tcMar>
               <w:top w:type="dxa" w:w="60"/>
               <w:left w:type="dxa" w:w="100"/>
@@ -3965,7 +3965,7 @@
         <w:tc>
           <w:tcPr>
             <w:tcW w:type="dxa" w:w="1000"/>
-            <w:shd w:fill="F4F7F6" w:val="clear"/>
+            <w:shd w:fill="F7F9FA" w:val="clear"/>
             <w:tcMar>
               <w:top w:type="dxa" w:w="60"/>
               <w:left w:type="dxa" w:w="100"/>
@@ -3993,7 +3993,7 @@
         <w:tc>
           <w:tcPr>
             <w:tcW w:type="dxa" w:w="2910"/>
-            <w:shd w:fill="F4F7F6" w:val="clear"/>
+            <w:shd w:fill="F7F9FA" w:val="clear"/>
             <w:tcMar>
               <w:top w:type="dxa" w:w="60"/>
               <w:left w:type="dxa" w:w="100"/>
@@ -4171,7 +4171,7 @@
         <w:tc>
           <w:tcPr>
             <w:tcW w:type="dxa" w:w="700"/>
-            <w:shd w:fill="F4F7F6" w:val="clear"/>
+            <w:shd w:fill="F7F9FA" w:val="clear"/>
             <w:tcMar>
               <w:top w:type="dxa" w:w="60"/>
               <w:left w:type="dxa" w:w="100"/>
@@ -4199,7 +4199,7 @@
         <w:tc>
           <w:tcPr>
             <w:tcW w:type="dxa" w:w="3000"/>
-            <w:shd w:fill="F4F7F6" w:val="clear"/>
+            <w:shd w:fill="F7F9FA" w:val="clear"/>
             <w:tcMar>
               <w:top w:type="dxa" w:w="60"/>
               <w:left w:type="dxa" w:w="100"/>
@@ -4227,7 +4227,7 @@
         <w:tc>
           <w:tcPr>
             <w:tcW w:type="dxa" w:w="1150"/>
-            <w:shd w:fill="F4F7F6" w:val="clear"/>
+            <w:shd w:fill="F7F9FA" w:val="clear"/>
             <w:tcMar>
               <w:top w:type="dxa" w:w="60"/>
               <w:left w:type="dxa" w:w="100"/>
@@ -4255,7 +4255,7 @@
         <w:tc>
           <w:tcPr>
             <w:tcW w:type="dxa" w:w="1000"/>
-            <w:shd w:fill="F4F7F6" w:val="clear"/>
+            <w:shd w:fill="F7F9FA" w:val="clear"/>
             <w:tcMar>
               <w:top w:type="dxa" w:w="60"/>
               <w:left w:type="dxa" w:w="100"/>
@@ -4283,7 +4283,7 @@
         <w:tc>
           <w:tcPr>
             <w:tcW w:type="dxa" w:w="2910"/>
-            <w:shd w:fill="F4F7F6" w:val="clear"/>
+            <w:shd w:fill="F7F9FA" w:val="clear"/>
             <w:tcMar>
               <w:top w:type="dxa" w:w="60"/>
               <w:left w:type="dxa" w:w="100"/>
@@ -4461,7 +4461,7 @@
         <w:tc>
           <w:tcPr>
             <w:tcW w:type="dxa" w:w="700"/>
-            <w:shd w:fill="F4F7F6" w:val="clear"/>
+            <w:shd w:fill="F7F9FA" w:val="clear"/>
             <w:tcMar>
               <w:top w:type="dxa" w:w="60"/>
               <w:left w:type="dxa" w:w="100"/>
@@ -4489,7 +4489,7 @@
         <w:tc>
           <w:tcPr>
             <w:tcW w:type="dxa" w:w="3000"/>
-            <w:shd w:fill="F4F7F6" w:val="clear"/>
+            <w:shd w:fill="F7F9FA" w:val="clear"/>
             <w:tcMar>
               <w:top w:type="dxa" w:w="60"/>
               <w:left w:type="dxa" w:w="100"/>
@@ -4517,7 +4517,7 @@
         <w:tc>
           <w:tcPr>
             <w:tcW w:type="dxa" w:w="1150"/>
-            <w:shd w:fill="F4F7F6" w:val="clear"/>
+            <w:shd w:fill="F7F9FA" w:val="clear"/>
             <w:tcMar>
               <w:top w:type="dxa" w:w="60"/>
               <w:left w:type="dxa" w:w="100"/>
@@ -4545,7 +4545,7 @@
         <w:tc>
           <w:tcPr>
             <w:tcW w:type="dxa" w:w="1000"/>
-            <w:shd w:fill="F4F7F6" w:val="clear"/>
+            <w:shd w:fill="F7F9FA" w:val="clear"/>
             <w:tcMar>
               <w:top w:type="dxa" w:w="60"/>
               <w:left w:type="dxa" w:w="100"/>
@@ -4573,7 +4573,7 @@
         <w:tc>
           <w:tcPr>
             <w:tcW w:type="dxa" w:w="2910"/>
-            <w:shd w:fill="F4F7F6" w:val="clear"/>
+            <w:shd w:fill="F7F9FA" w:val="clear"/>
             <w:tcMar>
               <w:top w:type="dxa" w:w="60"/>
               <w:left w:type="dxa" w:w="100"/>
@@ -4751,7 +4751,7 @@
         <w:tc>
           <w:tcPr>
             <w:tcW w:type="dxa" w:w="700"/>
-            <w:shd w:fill="F4F7F6" w:val="clear"/>
+            <w:shd w:fill="F7F9FA" w:val="clear"/>
             <w:tcMar>
               <w:top w:type="dxa" w:w="60"/>
               <w:left w:type="dxa" w:w="100"/>
@@ -4779,7 +4779,7 @@
         <w:tc>
           <w:tcPr>
             <w:tcW w:type="dxa" w:w="3000"/>
-            <w:shd w:fill="F4F7F6" w:val="clear"/>
+            <w:shd w:fill="F7F9FA" w:val="clear"/>
             <w:tcMar>
               <w:top w:type="dxa" w:w="60"/>
               <w:left w:type="dxa" w:w="100"/>
@@ -4807,7 +4807,7 @@
         <w:tc>
           <w:tcPr>
             <w:tcW w:type="dxa" w:w="1150"/>
-            <w:shd w:fill="F4F7F6" w:val="clear"/>
+            <w:shd w:fill="F7F9FA" w:val="clear"/>
             <w:tcMar>
               <w:top w:type="dxa" w:w="60"/>
               <w:left w:type="dxa" w:w="100"/>
@@ -4835,7 +4835,7 @@
         <w:tc>
           <w:tcPr>
             <w:tcW w:type="dxa" w:w="1000"/>
-            <w:shd w:fill="F4F7F6" w:val="clear"/>
+            <w:shd w:fill="F7F9FA" w:val="clear"/>
             <w:tcMar>
               <w:top w:type="dxa" w:w="60"/>
               <w:left w:type="dxa" w:w="100"/>
@@ -4863,7 +4863,7 @@
         <w:tc>
           <w:tcPr>
             <w:tcW w:type="dxa" w:w="2910"/>
-            <w:shd w:fill="F4F7F6" w:val="clear"/>
+            <w:shd w:fill="F7F9FA" w:val="clear"/>
             <w:tcMar>
               <w:top w:type="dxa" w:w="60"/>
               <w:left w:type="dxa" w:w="100"/>
@@ -5041,7 +5041,7 @@
         <w:tc>
           <w:tcPr>
             <w:tcW w:type="dxa" w:w="700"/>
-            <w:shd w:fill="F4F7F6" w:val="clear"/>
+            <w:shd w:fill="F7F9FA" w:val="clear"/>
             <w:tcMar>
               <w:top w:type="dxa" w:w="60"/>
               <w:left w:type="dxa" w:w="100"/>
@@ -5069,7 +5069,7 @@
         <w:tc>
           <w:tcPr>
             <w:tcW w:type="dxa" w:w="3000"/>
-            <w:shd w:fill="F4F7F6" w:val="clear"/>
+            <w:shd w:fill="F7F9FA" w:val="clear"/>
             <w:tcMar>
               <w:top w:type="dxa" w:w="60"/>
               <w:left w:type="dxa" w:w="100"/>
@@ -5097,7 +5097,7 @@
         <w:tc>
           <w:tcPr>
             <w:tcW w:type="dxa" w:w="1150"/>
-            <w:shd w:fill="F4F7F6" w:val="clear"/>
+            <w:shd w:fill="F7F9FA" w:val="clear"/>
             <w:tcMar>
               <w:top w:type="dxa" w:w="60"/>
               <w:left w:type="dxa" w:w="100"/>
@@ -5125,7 +5125,7 @@
         <w:tc>
           <w:tcPr>
             <w:tcW w:type="dxa" w:w="1000"/>
-            <w:shd w:fill="F4F7F6" w:val="clear"/>
+            <w:shd w:fill="F7F9FA" w:val="clear"/>
             <w:tcMar>
               <w:top w:type="dxa" w:w="60"/>
               <w:left w:type="dxa" w:w="100"/>
@@ -5153,7 +5153,7 @@
         <w:tc>
           <w:tcPr>
             <w:tcW w:type="dxa" w:w="2910"/>
-            <w:shd w:fill="F4F7F6" w:val="clear"/>
+            <w:shd w:fill="F7F9FA" w:val="clear"/>
             <w:tcMar>
               <w:top w:type="dxa" w:w="60"/>
               <w:left w:type="dxa" w:w="100"/>
@@ -5331,7 +5331,7 @@
         <w:tc>
           <w:tcPr>
             <w:tcW w:type="dxa" w:w="700"/>
-            <w:shd w:fill="F4F7F6" w:val="clear"/>
+            <w:shd w:fill="F7F9FA" w:val="clear"/>
             <w:tcMar>
               <w:top w:type="dxa" w:w="60"/>
               <w:left w:type="dxa" w:w="100"/>
@@ -5359,7 +5359,7 @@
         <w:tc>
           <w:tcPr>
             <w:tcW w:type="dxa" w:w="3000"/>
-            <w:shd w:fill="F4F7F6" w:val="clear"/>
+            <w:shd w:fill="F7F9FA" w:val="clear"/>
             <w:tcMar>
               <w:top w:type="dxa" w:w="60"/>
               <w:left w:type="dxa" w:w="100"/>
@@ -5387,7 +5387,7 @@
         <w:tc>
           <w:tcPr>
             <w:tcW w:type="dxa" w:w="1150"/>
-            <w:shd w:fill="F4F7F6" w:val="clear"/>
+            <w:shd w:fill="F7F9FA" w:val="clear"/>
             <w:tcMar>
               <w:top w:type="dxa" w:w="60"/>
               <w:left w:type="dxa" w:w="100"/>
@@ -5415,7 +5415,7 @@
         <w:tc>
           <w:tcPr>
             <w:tcW w:type="dxa" w:w="1000"/>
-            <w:shd w:fill="F4F7F6" w:val="clear"/>
+            <w:shd w:fill="F7F9FA" w:val="clear"/>
             <w:tcMar>
               <w:top w:type="dxa" w:w="60"/>
               <w:left w:type="dxa" w:w="100"/>
@@ -5443,7 +5443,7 @@
         <w:tc>
           <w:tcPr>
             <w:tcW w:type="dxa" w:w="2910"/>
-            <w:shd w:fill="F4F7F6" w:val="clear"/>
+            <w:shd w:fill="F7F9FA" w:val="clear"/>
             <w:tcMar>
               <w:top w:type="dxa" w:w="60"/>
               <w:left w:type="dxa" w:w="100"/>
@@ -5621,7 +5621,7 @@
         <w:tc>
           <w:tcPr>
             <w:tcW w:type="dxa" w:w="700"/>
-            <w:shd w:fill="F4F7F6" w:val="clear"/>
+            <w:shd w:fill="F7F9FA" w:val="clear"/>
             <w:tcMar>
               <w:top w:type="dxa" w:w="60"/>
               <w:left w:type="dxa" w:w="100"/>
@@ -5649,7 +5649,7 @@
         <w:tc>
           <w:tcPr>
             <w:tcW w:type="dxa" w:w="3000"/>
-            <w:shd w:fill="F4F7F6" w:val="clear"/>
+            <w:shd w:fill="F7F9FA" w:val="clear"/>
             <w:tcMar>
               <w:top w:type="dxa" w:w="60"/>
               <w:left w:type="dxa" w:w="100"/>
@@ -5677,7 +5677,7 @@
         <w:tc>
           <w:tcPr>
             <w:tcW w:type="dxa" w:w="1150"/>
-            <w:shd w:fill="F4F7F6" w:val="clear"/>
+            <w:shd w:fill="F7F9FA" w:val="clear"/>
             <w:tcMar>
               <w:top w:type="dxa" w:w="60"/>
               <w:left w:type="dxa" w:w="100"/>
@@ -5705,7 +5705,7 @@
         <w:tc>
           <w:tcPr>
             <w:tcW w:type="dxa" w:w="1000"/>
-            <w:shd w:fill="F4F7F6" w:val="clear"/>
+            <w:shd w:fill="F7F9FA" w:val="clear"/>
             <w:tcMar>
               <w:top w:type="dxa" w:w="60"/>
               <w:left w:type="dxa" w:w="100"/>
@@ -5733,7 +5733,7 @@
         <w:tc>
           <w:tcPr>
             <w:tcW w:type="dxa" w:w="2910"/>
-            <w:shd w:fill="F4F7F6" w:val="clear"/>
+            <w:shd w:fill="F7F9FA" w:val="clear"/>
             <w:tcMar>
               <w:top w:type="dxa" w:w="60"/>
               <w:left w:type="dxa" w:w="100"/>
@@ -5911,7 +5911,7 @@
         <w:tc>
           <w:tcPr>
             <w:tcW w:type="dxa" w:w="700"/>
-            <w:shd w:fill="F4F7F6" w:val="clear"/>
+            <w:shd w:fill="F7F9FA" w:val="clear"/>
             <w:tcMar>
               <w:top w:type="dxa" w:w="60"/>
               <w:left w:type="dxa" w:w="100"/>
@@ -5939,7 +5939,7 @@
         <w:tc>
           <w:tcPr>
             <w:tcW w:type="dxa" w:w="3000"/>
-            <w:shd w:fill="F4F7F6" w:val="clear"/>
+            <w:shd w:fill="F7F9FA" w:val="clear"/>
             <w:tcMar>
               <w:top w:type="dxa" w:w="60"/>
               <w:left w:type="dxa" w:w="100"/>
@@ -5967,7 +5967,7 @@
         <w:tc>
           <w:tcPr>
             <w:tcW w:type="dxa" w:w="1150"/>
-            <w:shd w:fill="F4F7F6" w:val="clear"/>
+            <w:shd w:fill="F7F9FA" w:val="clear"/>
             <w:tcMar>
               <w:top w:type="dxa" w:w="60"/>
               <w:left w:type="dxa" w:w="100"/>
@@ -5995,7 +5995,7 @@
         <w:tc>
           <w:tcPr>
             <w:tcW w:type="dxa" w:w="1000"/>
-            <w:shd w:fill="F4F7F6" w:val="clear"/>
+            <w:shd w:fill="F7F9FA" w:val="clear"/>
             <w:tcMar>
               <w:top w:type="dxa" w:w="60"/>
               <w:left w:type="dxa" w:w="100"/>
@@ -6023,7 +6023,7 @@
         <w:tc>
           <w:tcPr>
             <w:tcW w:type="dxa" w:w="2910"/>
-            <w:shd w:fill="F4F7F6" w:val="clear"/>
+            <w:shd w:fill="F7F9FA" w:val="clear"/>
             <w:tcMar>
               <w:top w:type="dxa" w:w="60"/>
               <w:left w:type="dxa" w:w="100"/>
@@ -6201,7 +6201,7 @@
         <w:tc>
           <w:tcPr>
             <w:tcW w:type="dxa" w:w="700"/>
-            <w:shd w:fill="F4F7F6" w:val="clear"/>
+            <w:shd w:fill="F7F9FA" w:val="clear"/>
             <w:tcMar>
               <w:top w:type="dxa" w:w="60"/>
               <w:left w:type="dxa" w:w="100"/>
@@ -6229,7 +6229,7 @@
         <w:tc>
           <w:tcPr>
             <w:tcW w:type="dxa" w:w="3000"/>
-            <w:shd w:fill="F4F7F6" w:val="clear"/>
+            <w:shd w:fill="F7F9FA" w:val="clear"/>
             <w:tcMar>
               <w:top w:type="dxa" w:w="60"/>
               <w:left w:type="dxa" w:w="100"/>
@@ -6257,7 +6257,7 @@
         <w:tc>
           <w:tcPr>
             <w:tcW w:type="dxa" w:w="1150"/>
-            <w:shd w:fill="F4F7F6" w:val="clear"/>
+            <w:shd w:fill="F7F9FA" w:val="clear"/>
             <w:tcMar>
               <w:top w:type="dxa" w:w="60"/>
               <w:left w:type="dxa" w:w="100"/>
@@ -6285,7 +6285,7 @@
         <w:tc>
           <w:tcPr>
             <w:tcW w:type="dxa" w:w="1000"/>
-            <w:shd w:fill="F4F7F6" w:val="clear"/>
+            <w:shd w:fill="F7F9FA" w:val="clear"/>
             <w:tcMar>
               <w:top w:type="dxa" w:w="60"/>
               <w:left w:type="dxa" w:w="100"/>
@@ -6313,7 +6313,7 @@
         <w:tc>
           <w:tcPr>
             <w:tcW w:type="dxa" w:w="2910"/>
-            <w:shd w:fill="F4F7F6" w:val="clear"/>
+            <w:shd w:fill="F7F9FA" w:val="clear"/>
             <w:tcMar>
               <w:top w:type="dxa" w:w="60"/>
               <w:left w:type="dxa" w:w="100"/>
@@ -6415,7 +6415,7 @@
         <w:tc>
           <w:tcPr>
             <w:tcW w:type="dxa" w:w="900"/>
-            <w:shd w:fill="DDEDE9" w:val="clear"/>
+            <w:shd w:fill="E3EFF2" w:val="clear"/>
             <w:tcMar>
               <w:top w:type="dxa" w:w="60"/>
               <w:left w:type="dxa" w:w="100"/>
@@ -6443,7 +6443,7 @@
         <w:tc>
           <w:tcPr>
             <w:tcW w:type="dxa" w:w="1350"/>
-            <w:shd w:fill="DDEDE9" w:val="clear"/>
+            <w:shd w:fill="E3EFF2" w:val="clear"/>
             <w:tcMar>
               <w:top w:type="dxa" w:w="60"/>
               <w:left w:type="dxa" w:w="100"/>
@@ -6471,7 +6471,7 @@
         <w:tc>
           <w:tcPr>
             <w:tcW w:type="dxa" w:w="3200"/>
-            <w:shd w:fill="DDEDE9" w:val="clear"/>
+            <w:shd w:fill="E3EFF2" w:val="clear"/>
             <w:tcMar>
               <w:top w:type="dxa" w:w="60"/>
               <w:left w:type="dxa" w:w="100"/>
@@ -6499,7 +6499,7 @@
         <w:tc>
           <w:tcPr>
             <w:tcW w:type="dxa" w:w="3310"/>
-            <w:shd w:fill="DDEDE9" w:val="clear"/>
+            <w:shd w:fill="E3EFF2" w:val="clear"/>
             <w:tcMar>
               <w:top w:type="dxa" w:w="60"/>
               <w:left w:type="dxa" w:w="100"/>
@@ -6649,7 +6649,7 @@
         <w:tc>
           <w:tcPr>
             <w:tcW w:type="dxa" w:w="900"/>
-            <w:shd w:fill="F4F7F6" w:val="clear"/>
+            <w:shd w:fill="F7F9FA" w:val="clear"/>
             <w:tcMar>
               <w:top w:type="dxa" w:w="60"/>
               <w:left w:type="dxa" w:w="100"/>
@@ -6677,7 +6677,7 @@
         <w:tc>
           <w:tcPr>
             <w:tcW w:type="dxa" w:w="1350"/>
-            <w:shd w:fill="F4F7F6" w:val="clear"/>
+            <w:shd w:fill="F7F9FA" w:val="clear"/>
             <w:tcMar>
               <w:top w:type="dxa" w:w="60"/>
               <w:left w:type="dxa" w:w="100"/>
@@ -6705,7 +6705,7 @@
         <w:tc>
           <w:tcPr>
             <w:tcW w:type="dxa" w:w="3200"/>
-            <w:shd w:fill="F4F7F6" w:val="clear"/>
+            <w:shd w:fill="F7F9FA" w:val="clear"/>
             <w:tcMar>
               <w:top w:type="dxa" w:w="60"/>
               <w:left w:type="dxa" w:w="100"/>
@@ -6733,7 +6733,7 @@
         <w:tc>
           <w:tcPr>
             <w:tcW w:type="dxa" w:w="3310"/>
-            <w:shd w:fill="F4F7F6" w:val="clear"/>
+            <w:shd w:fill="F7F9FA" w:val="clear"/>
             <w:tcMar>
               <w:top w:type="dxa" w:w="60"/>
               <w:left w:type="dxa" w:w="100"/>
@@ -6883,7 +6883,7 @@
         <w:tc>
           <w:tcPr>
             <w:tcW w:type="dxa" w:w="900"/>
-            <w:shd w:fill="F4F7F6" w:val="clear"/>
+            <w:shd w:fill="F7F9FA" w:val="clear"/>
             <w:tcMar>
               <w:top w:type="dxa" w:w="60"/>
               <w:left w:type="dxa" w:w="100"/>
@@ -6911,7 +6911,7 @@
         <w:tc>
           <w:tcPr>
             <w:tcW w:type="dxa" w:w="1350"/>
-            <w:shd w:fill="F4F7F6" w:val="clear"/>
+            <w:shd w:fill="F7F9FA" w:val="clear"/>
             <w:tcMar>
               <w:top w:type="dxa" w:w="60"/>
               <w:left w:type="dxa" w:w="100"/>
@@ -6939,7 +6939,7 @@
         <w:tc>
           <w:tcPr>
             <w:tcW w:type="dxa" w:w="3200"/>
-            <w:shd w:fill="F4F7F6" w:val="clear"/>
+            <w:shd w:fill="F7F9FA" w:val="clear"/>
             <w:tcMar>
               <w:top w:type="dxa" w:w="60"/>
               <w:left w:type="dxa" w:w="100"/>
@@ -6967,7 +6967,7 @@
         <w:tc>
           <w:tcPr>
             <w:tcW w:type="dxa" w:w="3310"/>
-            <w:shd w:fill="F4F7F6" w:val="clear"/>
+            <w:shd w:fill="F7F9FA" w:val="clear"/>
             <w:tcMar>
               <w:top w:type="dxa" w:w="60"/>
               <w:left w:type="dxa" w:w="100"/>
@@ -7117,7 +7117,7 @@
         <w:tc>
           <w:tcPr>
             <w:tcW w:type="dxa" w:w="900"/>
-            <w:shd w:fill="F4F7F6" w:val="clear"/>
+            <w:shd w:fill="F7F9FA" w:val="clear"/>
             <w:tcMar>
               <w:top w:type="dxa" w:w="60"/>
               <w:left w:type="dxa" w:w="100"/>
@@ -7145,7 +7145,7 @@
         <w:tc>
           <w:tcPr>
             <w:tcW w:type="dxa" w:w="1350"/>
-            <w:shd w:fill="F4F7F6" w:val="clear"/>
+            <w:shd w:fill="F7F9FA" w:val="clear"/>
             <w:tcMar>
               <w:top w:type="dxa" w:w="60"/>
               <w:left w:type="dxa" w:w="100"/>
@@ -7173,7 +7173,7 @@
         <w:tc>
           <w:tcPr>
             <w:tcW w:type="dxa" w:w="3200"/>
-            <w:shd w:fill="F4F7F6" w:val="clear"/>
+            <w:shd w:fill="F7F9FA" w:val="clear"/>
             <w:tcMar>
               <w:top w:type="dxa" w:w="60"/>
               <w:left w:type="dxa" w:w="100"/>
@@ -7201,7 +7201,7 @@
         <w:tc>
           <w:tcPr>
             <w:tcW w:type="dxa" w:w="3310"/>
-            <w:shd w:fill="F4F7F6" w:val="clear"/>
+            <w:shd w:fill="F7F9FA" w:val="clear"/>
             <w:tcMar>
               <w:top w:type="dxa" w:w="60"/>
               <w:left w:type="dxa" w:w="100"/>
@@ -7351,7 +7351,7 @@
         <w:tc>
           <w:tcPr>
             <w:tcW w:type="dxa" w:w="900"/>
-            <w:shd w:fill="F4F7F6" w:val="clear"/>
+            <w:shd w:fill="F7F9FA" w:val="clear"/>
             <w:tcMar>
               <w:top w:type="dxa" w:w="60"/>
               <w:left w:type="dxa" w:w="100"/>
@@ -7379,7 +7379,7 @@
         <w:tc>
           <w:tcPr>
             <w:tcW w:type="dxa" w:w="1350"/>
-            <w:shd w:fill="F4F7F6" w:val="clear"/>
+            <w:shd w:fill="F7F9FA" w:val="clear"/>
             <w:tcMar>
               <w:top w:type="dxa" w:w="60"/>
               <w:left w:type="dxa" w:w="100"/>
@@ -7407,7 +7407,7 @@
         <w:tc>
           <w:tcPr>
             <w:tcW w:type="dxa" w:w="3200"/>
-            <w:shd w:fill="F4F7F6" w:val="clear"/>
+            <w:shd w:fill="F7F9FA" w:val="clear"/>
             <w:tcMar>
               <w:top w:type="dxa" w:w="60"/>
               <w:left w:type="dxa" w:w="100"/>
@@ -7435,7 +7435,7 @@
         <w:tc>
           <w:tcPr>
             <w:tcW w:type="dxa" w:w="3310"/>
-            <w:shd w:fill="F4F7F6" w:val="clear"/>
+            <w:shd w:fill="F7F9FA" w:val="clear"/>
             <w:tcMar>
               <w:top w:type="dxa" w:w="60"/>
               <w:left w:type="dxa" w:w="100"/>
@@ -7585,7 +7585,7 @@
         <w:tc>
           <w:tcPr>
             <w:tcW w:type="dxa" w:w="900"/>
-            <w:shd w:fill="F4F7F6" w:val="clear"/>
+            <w:shd w:fill="F7F9FA" w:val="clear"/>
             <w:tcMar>
               <w:top w:type="dxa" w:w="60"/>
               <w:left w:type="dxa" w:w="100"/>
@@ -7613,7 +7613,7 @@
         <w:tc>
           <w:tcPr>
             <w:tcW w:type="dxa" w:w="1350"/>
-            <w:shd w:fill="F4F7F6" w:val="clear"/>
+            <w:shd w:fill="F7F9FA" w:val="clear"/>
             <w:tcMar>
               <w:top w:type="dxa" w:w="60"/>
               <w:left w:type="dxa" w:w="100"/>
@@ -7641,7 +7641,7 @@
         <w:tc>
           <w:tcPr>
             <w:tcW w:type="dxa" w:w="3200"/>
-            <w:shd w:fill="F4F7F6" w:val="clear"/>
+            <w:shd w:fill="F7F9FA" w:val="clear"/>
             <w:tcMar>
               <w:top w:type="dxa" w:w="60"/>
               <w:left w:type="dxa" w:w="100"/>
@@ -7669,7 +7669,7 @@
         <w:tc>
           <w:tcPr>
             <w:tcW w:type="dxa" w:w="3310"/>
-            <w:shd w:fill="F4F7F6" w:val="clear"/>
+            <w:shd w:fill="F7F9FA" w:val="clear"/>
             <w:tcMar>
               <w:top w:type="dxa" w:w="60"/>
               <w:left w:type="dxa" w:w="100"/>
@@ -7819,7 +7819,7 @@
         <w:tc>
           <w:tcPr>
             <w:tcW w:type="dxa" w:w="900"/>
-            <w:shd w:fill="F4F7F6" w:val="clear"/>
+            <w:shd w:fill="F7F9FA" w:val="clear"/>
             <w:tcMar>
               <w:top w:type="dxa" w:w="60"/>
               <w:left w:type="dxa" w:w="100"/>
@@ -7847,7 +7847,7 @@
         <w:tc>
           <w:tcPr>
             <w:tcW w:type="dxa" w:w="1350"/>
-            <w:shd w:fill="F4F7F6" w:val="clear"/>
+            <w:shd w:fill="F7F9FA" w:val="clear"/>
             <w:tcMar>
               <w:top w:type="dxa" w:w="60"/>
               <w:left w:type="dxa" w:w="100"/>
@@ -7875,7 +7875,7 @@
         <w:tc>
           <w:tcPr>
             <w:tcW w:type="dxa" w:w="3200"/>
-            <w:shd w:fill="F4F7F6" w:val="clear"/>
+            <w:shd w:fill="F7F9FA" w:val="clear"/>
             <w:tcMar>
               <w:top w:type="dxa" w:w="60"/>
               <w:left w:type="dxa" w:w="100"/>
@@ -7903,7 +7903,7 @@
         <w:tc>
           <w:tcPr>
             <w:tcW w:type="dxa" w:w="3310"/>
-            <w:shd w:fill="F4F7F6" w:val="clear"/>
+            <w:shd w:fill="F7F9FA" w:val="clear"/>
             <w:tcMar>
               <w:top w:type="dxa" w:w="60"/>
               <w:left w:type="dxa" w:w="100"/>
@@ -8053,7 +8053,7 @@
         <w:tc>
           <w:tcPr>
             <w:tcW w:type="dxa" w:w="900"/>
-            <w:shd w:fill="F4F7F6" w:val="clear"/>
+            <w:shd w:fill="F7F9FA" w:val="clear"/>
             <w:tcMar>
               <w:top w:type="dxa" w:w="60"/>
               <w:left w:type="dxa" w:w="100"/>
@@ -8081,7 +8081,7 @@
         <w:tc>
           <w:tcPr>
             <w:tcW w:type="dxa" w:w="1350"/>
-            <w:shd w:fill="F4F7F6" w:val="clear"/>
+            <w:shd w:fill="F7F9FA" w:val="clear"/>
             <w:tcMar>
               <w:top w:type="dxa" w:w="60"/>
               <w:left w:type="dxa" w:w="100"/>
@@ -8109,7 +8109,7 @@
         <w:tc>
           <w:tcPr>
             <w:tcW w:type="dxa" w:w="3200"/>
-            <w:shd w:fill="F4F7F6" w:val="clear"/>
+            <w:shd w:fill="F7F9FA" w:val="clear"/>
             <w:tcMar>
               <w:top w:type="dxa" w:w="60"/>
               <w:left w:type="dxa" w:w="100"/>
@@ -8137,7 +8137,7 @@
         <w:tc>
           <w:tcPr>
             <w:tcW w:type="dxa" w:w="3310"/>
-            <w:shd w:fill="F4F7F6" w:val="clear"/>
+            <w:shd w:fill="F7F9FA" w:val="clear"/>
             <w:tcMar>
               <w:top w:type="dxa" w:w="60"/>
               <w:left w:type="dxa" w:w="100"/>
@@ -8287,7 +8287,7 @@
         <w:tc>
           <w:tcPr>
             <w:tcW w:type="dxa" w:w="900"/>
-            <w:shd w:fill="F4F7F6" w:val="clear"/>
+            <w:shd w:fill="F7F9FA" w:val="clear"/>
             <w:tcMar>
               <w:top w:type="dxa" w:w="60"/>
               <w:left w:type="dxa" w:w="100"/>
@@ -8315,7 +8315,7 @@
         <w:tc>
           <w:tcPr>
             <w:tcW w:type="dxa" w:w="1350"/>
-            <w:shd w:fill="F4F7F6" w:val="clear"/>
+            <w:shd w:fill="F7F9FA" w:val="clear"/>
             <w:tcMar>
               <w:top w:type="dxa" w:w="60"/>
               <w:left w:type="dxa" w:w="100"/>
@@ -8343,7 +8343,7 @@
         <w:tc>
           <w:tcPr>
             <w:tcW w:type="dxa" w:w="3200"/>
-            <w:shd w:fill="F4F7F6" w:val="clear"/>
+            <w:shd w:fill="F7F9FA" w:val="clear"/>
             <w:tcMar>
               <w:top w:type="dxa" w:w="60"/>
               <w:left w:type="dxa" w:w="100"/>
@@ -8371,7 +8371,7 @@
         <w:tc>
           <w:tcPr>
             <w:tcW w:type="dxa" w:w="3310"/>
-            <w:shd w:fill="F4F7F6" w:val="clear"/>
+            <w:shd w:fill="F7F9FA" w:val="clear"/>
             <w:tcMar>
               <w:top w:type="dxa" w:w="60"/>
               <w:left w:type="dxa" w:w="100"/>
@@ -8509,7 +8509,7 @@
                 <w:sz w:val="18"/>
                 <w:szCs w:val="18"/>
               </w:rPr>
-              <w:t xml:space="preserve">128 pruebas en menos de dos segundos. Verificado.</w:t>
+              <w:t xml:space="preserve">146 pruebas en menos de dos segundos. Verificado.</w:t>
             </w:r>
           </w:p>
         </w:tc>
@@ -8521,7 +8521,7 @@
         <w:tc>
           <w:tcPr>
             <w:tcW w:type="dxa" w:w="900"/>
-            <w:shd w:fill="F4F7F6" w:val="clear"/>
+            <w:shd w:fill="F7F9FA" w:val="clear"/>
             <w:tcMar>
               <w:top w:type="dxa" w:w="60"/>
               <w:left w:type="dxa" w:w="100"/>
@@ -8549,7 +8549,7 @@
         <w:tc>
           <w:tcPr>
             <w:tcW w:type="dxa" w:w="1350"/>
-            <w:shd w:fill="F4F7F6" w:val="clear"/>
+            <w:shd w:fill="F7F9FA" w:val="clear"/>
             <w:tcMar>
               <w:top w:type="dxa" w:w="60"/>
               <w:left w:type="dxa" w:w="100"/>
@@ -8577,7 +8577,7 @@
         <w:tc>
           <w:tcPr>
             <w:tcW w:type="dxa" w:w="3200"/>
-            <w:shd w:fill="F4F7F6" w:val="clear"/>
+            <w:shd w:fill="F7F9FA" w:val="clear"/>
             <w:tcMar>
               <w:top w:type="dxa" w:w="60"/>
               <w:left w:type="dxa" w:w="100"/>
@@ -8605,7 +8605,7 @@
         <w:tc>
           <w:tcPr>
             <w:tcW w:type="dxa" w:w="3310"/>
-            <w:shd w:fill="F4F7F6" w:val="clear"/>
+            <w:shd w:fill="F7F9FA" w:val="clear"/>
             <w:tcMar>
               <w:top w:type="dxa" w:w="60"/>
               <w:left w:type="dxa" w:w="100"/>
@@ -8755,7 +8755,7 @@
         <w:tc>
           <w:tcPr>
             <w:tcW w:type="dxa" w:w="900"/>
-            <w:shd w:fill="F4F7F6" w:val="clear"/>
+            <w:shd w:fill="F7F9FA" w:val="clear"/>
             <w:tcMar>
               <w:top w:type="dxa" w:w="60"/>
               <w:left w:type="dxa" w:w="100"/>
@@ -8783,7 +8783,7 @@
         <w:tc>
           <w:tcPr>
             <w:tcW w:type="dxa" w:w="1350"/>
-            <w:shd w:fill="F4F7F6" w:val="clear"/>
+            <w:shd w:fill="F7F9FA" w:val="clear"/>
             <w:tcMar>
               <w:top w:type="dxa" w:w="60"/>
               <w:left w:type="dxa" w:w="100"/>
@@ -8811,7 +8811,7 @@
         <w:tc>
           <w:tcPr>
             <w:tcW w:type="dxa" w:w="3200"/>
-            <w:shd w:fill="F4F7F6" w:val="clear"/>
+            <w:shd w:fill="F7F9FA" w:val="clear"/>
             <w:tcMar>
               <w:top w:type="dxa" w:w="60"/>
               <w:left w:type="dxa" w:w="100"/>
@@ -8839,7 +8839,7 @@
         <w:tc>
           <w:tcPr>
             <w:tcW w:type="dxa" w:w="3310"/>
-            <w:shd w:fill="F4F7F6" w:val="clear"/>
+            <w:shd w:fill="F7F9FA" w:val="clear"/>
             <w:tcMar>
               <w:top w:type="dxa" w:w="60"/>
               <w:left w:type="dxa" w:w="100"/>
@@ -8989,7 +8989,7 @@
         <w:tc>
           <w:tcPr>
             <w:tcW w:type="dxa" w:w="900"/>
-            <w:shd w:fill="F4F7F6" w:val="clear"/>
+            <w:shd w:fill="F7F9FA" w:val="clear"/>
             <w:tcMar>
               <w:top w:type="dxa" w:w="60"/>
               <w:left w:type="dxa" w:w="100"/>
@@ -9017,7 +9017,7 @@
         <w:tc>
           <w:tcPr>
             <w:tcW w:type="dxa" w:w="1350"/>
-            <w:shd w:fill="F4F7F6" w:val="clear"/>
+            <w:shd w:fill="F7F9FA" w:val="clear"/>
             <w:tcMar>
               <w:top w:type="dxa" w:w="60"/>
               <w:left w:type="dxa" w:w="100"/>
@@ -9045,7 +9045,7 @@
         <w:tc>
           <w:tcPr>
             <w:tcW w:type="dxa" w:w="3200"/>
-            <w:shd w:fill="F4F7F6" w:val="clear"/>
+            <w:shd w:fill="F7F9FA" w:val="clear"/>
             <w:tcMar>
               <w:top w:type="dxa" w:w="60"/>
               <w:left w:type="dxa" w:w="100"/>
@@ -9073,7 +9073,7 @@
         <w:tc>
           <w:tcPr>
             <w:tcW w:type="dxa" w:w="3310"/>
-            <w:shd w:fill="F4F7F6" w:val="clear"/>
+            <w:shd w:fill="F7F9FA" w:val="clear"/>
             <w:tcMar>
               <w:top w:type="dxa" w:w="60"/>
               <w:left w:type="dxa" w:w="100"/>
@@ -9223,7 +9223,7 @@
         <w:tc>
           <w:tcPr>
             <w:tcW w:type="dxa" w:w="900"/>
-            <w:shd w:fill="F4F7F6" w:val="clear"/>
+            <w:shd w:fill="F7F9FA" w:val="clear"/>
             <w:tcMar>
               <w:top w:type="dxa" w:w="60"/>
               <w:left w:type="dxa" w:w="100"/>
@@ -9251,7 +9251,7 @@
         <w:tc>
           <w:tcPr>
             <w:tcW w:type="dxa" w:w="1350"/>
-            <w:shd w:fill="F4F7F6" w:val="clear"/>
+            <w:shd w:fill="F7F9FA" w:val="clear"/>
             <w:tcMar>
               <w:top w:type="dxa" w:w="60"/>
               <w:left w:type="dxa" w:w="100"/>
@@ -9279,7 +9279,7 @@
         <w:tc>
           <w:tcPr>
             <w:tcW w:type="dxa" w:w="3200"/>
-            <w:shd w:fill="F4F7F6" w:val="clear"/>
+            <w:shd w:fill="F7F9FA" w:val="clear"/>
             <w:tcMar>
               <w:top w:type="dxa" w:w="60"/>
               <w:left w:type="dxa" w:w="100"/>
@@ -9307,7 +9307,7 @@
         <w:tc>
           <w:tcPr>
             <w:tcW w:type="dxa" w:w="3310"/>
-            <w:shd w:fill="F4F7F6" w:val="clear"/>
+            <w:shd w:fill="F7F9FA" w:val="clear"/>
             <w:tcMar>
               <w:top w:type="dxa" w:w="60"/>
               <w:left w:type="dxa" w:w="100"/>
@@ -9498,7 +9498,7 @@
           <w:sz w:val="24"/>
           <w:szCs w:val="24"/>
         </w:rPr>
-        <w:t xml:space="preserve">Cada requerimiento funcional puede rastrearse hasta el archivo que lo implementa y hasta la prueba automatizada que lo verifica. Los nombres de la última columna corresponden a archivos TypeScript de los directorios de casos de uso y de dominio del backend, salvo AlarmasExpo, que pertenece a la aplicación móvil.</w:t>
+        <w:t xml:space="preserve">Cada requerimiento funcional puede rastrearse hasta el archivo que lo implementa y hasta la prueba automatizada que lo verifica. Los nombres de la última columna corresponden a archivos TypeScript de los directorios de casos de uso y de dominio del backend, con tres excepciones: NotificadorExpoPush pertenece a la capa de infraestructura del backend, y AlarmasExpo y NavegacionPorNotificaciones pertenecen a la aplicación móvil.</w:t>
       </w:r>
     </w:p>
     <w:p>
@@ -9512,7 +9512,7 @@
           <w:sz w:val="24"/>
           <w:szCs w:val="24"/>
         </w:rPr>
-        <w:t xml:space="preserve">Las pruebas correspondientes se encuentran en los archivos dominio.test.ts, zonaHoraria.test.ts, casosDeUso.test.ts y notificaciones.test.ts del directorio de pruebas del backend, y se ejecutan con el comando npm test.</w:t>
+        <w:t xml:space="preserve">Las pruebas correspondientes se encuentran en los archivos dominio.test.ts, zonaHoraria.test.ts, casosDeUso.test.ts, notificaciones.test.ts, recuperacion.test.ts y sesiones.test.ts del directorio de pruebas del backend, y se ejecutan con el comando npm test.</w:t>
       </w:r>
     </w:p>
     <w:sectPr>

</xml_diff>

<commit_message>
Los ocho diagramas al dia y la documentacion con la paleta de la marca
01, 02 y 07 completados: recuperacion de contrasena, gestion de medicamentos del cuidador, Dispositivo y SolicitudDeRecuperacion, y los puertos de correo y codigos. Revisados mirando las imagenes: dos casos de uso estaban dibujados sin linea al actor.
</commit_message>
<xml_diff>
--- a/docs/Chronova-Requerimientos.docx
+++ b/docs/Chronova-Requerimientos.docx
@@ -12,7 +12,7 @@
           <w:rFonts w:ascii="Cambria" w:cs="Cambria" w:eastAsia="Cambria" w:hAnsi="Cambria"/>
           <w:b/>
           <w:bCs/>
-          <w:color w:val="0B5563"/>
+          <w:color w:val="185A66"/>
           <w:sz w:val="32"/>
           <w:szCs w:val="32"/>
         </w:rPr>
@@ -144,7 +144,7 @@
         <w:tc>
           <w:tcPr>
             <w:tcW w:type="dxa" w:w="1700"/>
-            <w:shd w:fill="E3EFF2" w:val="clear"/>
+            <w:shd w:fill="E1EFF2" w:val="clear"/>
             <w:tcMar>
               <w:top w:type="dxa" w:w="60"/>
               <w:left w:type="dxa" w:w="100"/>
@@ -172,7 +172,7 @@
         <w:tc>
           <w:tcPr>
             <w:tcW w:type="dxa" w:w="3400"/>
-            <w:shd w:fill="E3EFF2" w:val="clear"/>
+            <w:shd w:fill="E1EFF2" w:val="clear"/>
             <w:tcMar>
               <w:top w:type="dxa" w:w="60"/>
               <w:left w:type="dxa" w:w="100"/>
@@ -200,7 +200,7 @@
         <w:tc>
           <w:tcPr>
             <w:tcW w:type="dxa" w:w="3660"/>
-            <w:shd w:fill="E3EFF2" w:val="clear"/>
+            <w:shd w:fill="E1EFF2" w:val="clear"/>
             <w:tcMar>
               <w:top w:type="dxa" w:w="60"/>
               <w:left w:type="dxa" w:w="100"/>
@@ -578,7 +578,7 @@
         <w:tc>
           <w:tcPr>
             <w:tcW w:type="dxa" w:w="2000"/>
-            <w:shd w:fill="E3EFF2" w:val="clear"/>
+            <w:shd w:fill="E1EFF2" w:val="clear"/>
             <w:tcMar>
               <w:top w:type="dxa" w:w="60"/>
               <w:left w:type="dxa" w:w="100"/>
@@ -606,7 +606,7 @@
         <w:tc>
           <w:tcPr>
             <w:tcW w:type="dxa" w:w="1400"/>
-            <w:shd w:fill="E3EFF2" w:val="clear"/>
+            <w:shd w:fill="E1EFF2" w:val="clear"/>
             <w:tcMar>
               <w:top w:type="dxa" w:w="60"/>
               <w:left w:type="dxa" w:w="100"/>
@@ -634,7 +634,7 @@
         <w:tc>
           <w:tcPr>
             <w:tcW w:type="dxa" w:w="5360"/>
-            <w:shd w:fill="E3EFF2" w:val="clear"/>
+            <w:shd w:fill="E1EFF2" w:val="clear"/>
             <w:tcMar>
               <w:top w:type="dxa" w:w="60"/>
               <w:left w:type="dxa" w:w="100"/>
@@ -1271,7 +1271,7 @@
         <w:tc>
           <w:tcPr>
             <w:tcW w:type="dxa" w:w="700"/>
-            <w:shd w:fill="E3EFF2" w:val="clear"/>
+            <w:shd w:fill="E1EFF2" w:val="clear"/>
             <w:tcMar>
               <w:top w:type="dxa" w:w="60"/>
               <w:left w:type="dxa" w:w="100"/>
@@ -1299,7 +1299,7 @@
         <w:tc>
           <w:tcPr>
             <w:tcW w:type="dxa" w:w="3000"/>
-            <w:shd w:fill="E3EFF2" w:val="clear"/>
+            <w:shd w:fill="E1EFF2" w:val="clear"/>
             <w:tcMar>
               <w:top w:type="dxa" w:w="60"/>
               <w:left w:type="dxa" w:w="100"/>
@@ -1327,7 +1327,7 @@
         <w:tc>
           <w:tcPr>
             <w:tcW w:type="dxa" w:w="1150"/>
-            <w:shd w:fill="E3EFF2" w:val="clear"/>
+            <w:shd w:fill="E1EFF2" w:val="clear"/>
             <w:tcMar>
               <w:top w:type="dxa" w:w="60"/>
               <w:left w:type="dxa" w:w="100"/>
@@ -1355,7 +1355,7 @@
         <w:tc>
           <w:tcPr>
             <w:tcW w:type="dxa" w:w="1000"/>
-            <w:shd w:fill="E3EFF2" w:val="clear"/>
+            <w:shd w:fill="E1EFF2" w:val="clear"/>
             <w:tcMar>
               <w:top w:type="dxa" w:w="60"/>
               <w:left w:type="dxa" w:w="100"/>
@@ -1383,7 +1383,7 @@
         <w:tc>
           <w:tcPr>
             <w:tcW w:type="dxa" w:w="2910"/>
-            <w:shd w:fill="E3EFF2" w:val="clear"/>
+            <w:shd w:fill="E1EFF2" w:val="clear"/>
             <w:tcMar>
               <w:top w:type="dxa" w:w="60"/>
               <w:left w:type="dxa" w:w="100"/>
@@ -6415,7 +6415,7 @@
         <w:tc>
           <w:tcPr>
             <w:tcW w:type="dxa" w:w="900"/>
-            <w:shd w:fill="E3EFF2" w:val="clear"/>
+            <w:shd w:fill="E1EFF2" w:val="clear"/>
             <w:tcMar>
               <w:top w:type="dxa" w:w="60"/>
               <w:left w:type="dxa" w:w="100"/>
@@ -6443,7 +6443,7 @@
         <w:tc>
           <w:tcPr>
             <w:tcW w:type="dxa" w:w="1350"/>
-            <w:shd w:fill="E3EFF2" w:val="clear"/>
+            <w:shd w:fill="E1EFF2" w:val="clear"/>
             <w:tcMar>
               <w:top w:type="dxa" w:w="60"/>
               <w:left w:type="dxa" w:w="100"/>
@@ -6471,7 +6471,7 @@
         <w:tc>
           <w:tcPr>
             <w:tcW w:type="dxa" w:w="3200"/>
-            <w:shd w:fill="E3EFF2" w:val="clear"/>
+            <w:shd w:fill="E1EFF2" w:val="clear"/>
             <w:tcMar>
               <w:top w:type="dxa" w:w="60"/>
               <w:left w:type="dxa" w:w="100"/>
@@ -6499,7 +6499,7 @@
         <w:tc>
           <w:tcPr>
             <w:tcW w:type="dxa" w:w="3310"/>
-            <w:shd w:fill="E3EFF2" w:val="clear"/>
+            <w:shd w:fill="E1EFF2" w:val="clear"/>
             <w:tcMar>
               <w:top w:type="dxa" w:w="60"/>
               <w:left w:type="dxa" w:w="100"/>

</xml_diff>